<commit_message>
First draft review comments fixed
</commit_message>
<xml_diff>
--- a/Aravinth K First Draft.docx
+++ b/Aravinth K First Draft.docx
@@ -352,7 +352,13 @@
         <w:t xml:space="preserve">Embedded Systems:  </w:t>
       </w:r>
       <w:r>
-        <w:t xml:space="preserve">Firmware Development, Embedded Software Design, System Integration, </w:t>
+        <w:t xml:space="preserve">Firmware Development, </w:t>
+      </w:r>
+      <w:r>
+        <w:t xml:space="preserve">Firmware Validation, </w:t>
+      </w:r>
+      <w:r>
+        <w:t xml:space="preserve">Embedded Software Design, System Integration, </w:t>
       </w:r>
       <w:r>
         <w:t>Debugging</w:t>
@@ -407,7 +413,13 @@
         <w:t xml:space="preserve">Tools &amp; IDEs:  </w:t>
       </w:r>
       <w:r>
-        <w:t xml:space="preserve">Git, Gerrit, JIRA, GDB, JTAG, </w:t>
+        <w:t>Git, Gerrit</w:t>
+      </w:r>
+      <w:r>
+        <w:t>, Version control</w:t>
+      </w:r>
+      <w:r>
+        <w:t xml:space="preserve">, JIRA, GDB, JTAG, </w:t>
       </w:r>
       <w:r>
         <w:t>Oscilloscope</w:t>
@@ -1435,97 +1447,7 @@
         <w:t>Nandha College of Technology, Erode</w:t>
       </w:r>
     </w:p>
-    <w:p>
-      <w:pPr>
-        <w:rPr>
-          <w:rFonts w:ascii="Arial" w:hAnsi="Arial" w:cs="Arial"/>
-          <w:w w:val="105"/>
-        </w:rPr>
-      </w:pPr>
-    </w:p>
-    <w:p>
-      <w:pPr>
-        <w:jc w:val="both"/>
-        <w:rPr>
-          <w:sz w:val="22"/>
-          <w:szCs w:val="22"/>
-        </w:rPr>
-      </w:pPr>
-      <w:r>
-        <w:rPr>
-          <w:sz w:val="22"/>
-          <w:szCs w:val="22"/>
-        </w:rPr>
-        <w:t>Date</w:t>
-      </w:r>
-      <w:r>
-        <w:rPr>
-          <w:sz w:val="22"/>
-          <w:szCs w:val="22"/>
-        </w:rPr>
-        <w:tab/>
-        <w:t>:</w:t>
-      </w:r>
-      <w:r>
-        <w:rPr>
-          <w:sz w:val="22"/>
-          <w:szCs w:val="22"/>
-        </w:rPr>
-        <w:t xml:space="preserve">                                                                                                                                       </w:t>
-      </w:r>
-      <w:r>
-        <w:rPr>
-          <w:sz w:val="22"/>
-          <w:szCs w:val="22"/>
-        </w:rPr>
-        <w:t xml:space="preserve">    </w:t>
-      </w:r>
-      <w:r>
-        <w:rPr>
-          <w:sz w:val="22"/>
-          <w:szCs w:val="22"/>
-        </w:rPr>
-        <w:t>Signature</w:t>
-      </w:r>
-    </w:p>
-    <w:p>
-      <w:r>
-        <w:rPr>
-          <w:sz w:val="22"/>
-          <w:szCs w:val="22"/>
-        </w:rPr>
-        <w:t>Place</w:t>
-      </w:r>
-      <w:r>
-        <w:rPr>
-          <w:sz w:val="22"/>
-          <w:szCs w:val="22"/>
-        </w:rPr>
-        <w:tab/>
-        <w:t>:</w:t>
-      </w:r>
-      <w:r>
-        <w:rPr>
-          <w:sz w:val="22"/>
-          <w:szCs w:val="22"/>
-        </w:rPr>
-        <w:t xml:space="preserve">                                                                                                                                      </w:t>
-      </w:r>
-      <w:r>
-        <w:rPr>
-          <w:sz w:val="22"/>
-          <w:szCs w:val="22"/>
-        </w:rPr>
-        <w:t xml:space="preserve">    </w:t>
-      </w:r>
-      <w:r>
-        <w:rPr>
-          <w:sz w:val="22"/>
-          <w:szCs w:val="22"/>
-        </w:rPr>
-        <w:t>(Aravinth K)</w:t>
-      </w:r>
-    </w:p>
+    <w:p/>
     <w:sectPr>
       <w:pgSz w:w="12240" w:h="15840"/>
       <w:pgMar w:top="720" w:right="1080" w:bottom="720" w:left="1080" w:header="708" w:footer="708" w:gutter="0"/>

</xml_diff>

<commit_message>
Claude review comments fixed
</commit_message>
<xml_diff>
--- a/Aravinth K First Draft.docx
+++ b/Aravinth K First Draft.docx
@@ -4,20 +4,16 @@
   <w:body>
     <w:p>
       <w:pPr>
-        <w:spacing w:after="44"/>
         <w:jc w:val="center"/>
         <w:rPr>
+          <w:color w:val="1B3A5C"/>
           <w:sz w:val="62"/>
           <w:szCs w:val="62"/>
         </w:rPr>
       </w:pPr>
       <w:r>
         <w:rPr>
-          <w:b/>
-          <w:bCs/>
-          <w:caps/>
           <w:color w:val="1B3A5C"/>
-          <w:spacing w:val="100"/>
           <w:sz w:val="62"/>
           <w:szCs w:val="62"/>
         </w:rPr>
@@ -94,15 +90,378 @@
     </w:p>
     <w:p>
       <w:pPr>
+        <w:rPr>
+          <w:color w:val="1B3A5C"/>
+          <w:sz w:val="24"/>
+          <w:szCs w:val="24"/>
+        </w:rPr>
+      </w:pPr>
+    </w:p>
+    <w:p>
+      <w:pPr>
+        <w:pBdr>
+          <w:bottom w:val="single" w:sz="8" w:space="1" w:color="0D7490"/>
+        </w:pBdr>
+        <w:rPr>
+          <w:b/>
+          <w:bCs/>
+          <w:color w:val="1B3A5C"/>
+          <w:sz w:val="24"/>
+          <w:szCs w:val="24"/>
+        </w:rPr>
+      </w:pPr>
+      <w:r>
+        <w:rPr>
+          <w:b/>
+          <w:bCs/>
+          <w:color w:val="1B3A5C"/>
+          <w:sz w:val="24"/>
+          <w:szCs w:val="24"/>
+        </w:rPr>
+        <w:t>PROFILE SUMMARY</w:t>
+      </w:r>
+    </w:p>
+    <w:p>
+      <w:pPr>
+        <w:spacing w:before="280" w:after="100"/>
+      </w:pPr>
+      <w:r>
+        <w:t xml:space="preserve">Senior Embedded Firmware Engineer with 6+ years of experience in embedded firmware development, debugging, integration and validation across industrial automation and consumer electronics </w:t>
+      </w:r>
+      <w:r>
+        <w:t>domains. Skilled</w:t>
+      </w:r>
+      <w:r>
+        <w:t xml:space="preserve"> in Embedded C/C++, Zephyr RTOS, Embedded Linux and communication protocols including CAN, SPI, I2C, UART and MQTT. Delivered firmware for three commercial Corsair sim-racing products and received several Bosch awards for quality and delivery excellence.</w:t>
+      </w:r>
+    </w:p>
+    <w:p>
+      <w:pPr>
         <w:pBdr>
           <w:bottom w:val="single" w:sz="8" w:space="1" w:color="0D7490"/>
         </w:pBdr>
         <w:spacing w:before="280" w:after="100"/>
-        <w:rPr>
+      </w:pPr>
+      <w:r>
+        <w:rPr>
+          <w:b/>
+          <w:bCs/>
+          <w:color w:val="1B3A5C"/>
           <w:sz w:val="24"/>
           <w:szCs w:val="24"/>
         </w:rPr>
-      </w:pPr>
+        <w:t>TECHNICAL SKILLS</w:t>
+      </w:r>
+    </w:p>
+    <w:p>
+      <w:pPr>
+        <w:spacing w:before="72" w:after="72"/>
+      </w:pPr>
+      <w:r>
+        <w:rPr>
+          <w:b/>
+          <w:bCs/>
+          <w:color w:val="1B3A5C"/>
+        </w:rPr>
+        <w:t>Programming Languages</w:t>
+      </w:r>
+      <w:r>
+        <w:rPr>
+          <w:b/>
+          <w:bCs/>
+          <w:color w:val="1B3A5C"/>
+        </w:rPr>
+        <w:t xml:space="preserve">:  </w:t>
+      </w:r>
+      <w:r>
+        <w:t>Embedded C, C++, Shell Script</w:t>
+      </w:r>
+      <w:r>
+        <w:t>ing</w:t>
+      </w:r>
+    </w:p>
+    <w:p>
+      <w:pPr>
+        <w:spacing w:before="72" w:after="72"/>
+      </w:pPr>
+      <w:r>
+        <w:rPr>
+          <w:b/>
+          <w:bCs/>
+          <w:color w:val="1B3A5C"/>
+        </w:rPr>
+        <w:t>RTOS &amp; Operating Systems:</w:t>
+      </w:r>
+      <w:r>
+        <w:rPr>
+          <w:b/>
+          <w:bCs/>
+          <w:color w:val="1B3A5C"/>
+        </w:rPr>
+        <w:t xml:space="preserve">  </w:t>
+      </w:r>
+      <w:r>
+        <w:t>Zephyr RTOS, Embedded Linux</w:t>
+      </w:r>
+    </w:p>
+    <w:p>
+      <w:pPr>
+        <w:spacing w:before="72" w:after="72"/>
+      </w:pPr>
+      <w:r>
+        <w:rPr>
+          <w:b/>
+          <w:bCs/>
+          <w:color w:val="1B3A5C"/>
+        </w:rPr>
+        <w:t xml:space="preserve">Microcontrollers:  </w:t>
+      </w:r>
+      <w:r>
+        <w:t>STM32, TI</w:t>
+      </w:r>
+      <w:r>
+        <w:t xml:space="preserve"> TIVA C</w:t>
+      </w:r>
+      <w:r>
+        <w:t xml:space="preserve">, </w:t>
+      </w:r>
+      <w:r>
+        <w:t>NXP</w:t>
+      </w:r>
+      <w:r>
+        <w:t xml:space="preserve"> LPC Series</w:t>
+      </w:r>
+      <w:r>
+        <w:t>, At</w:t>
+      </w:r>
+      <w:r>
+        <w:t>mel</w:t>
+      </w:r>
+      <w:r>
+        <w:t xml:space="preserve"> AVR/SAM</w:t>
+      </w:r>
+      <w:r>
+        <w:t>, Microchip</w:t>
+      </w:r>
+      <w:r>
+        <w:t xml:space="preserve"> PIC</w:t>
+      </w:r>
+    </w:p>
+    <w:p>
+      <w:pPr>
+        <w:spacing w:before="72" w:after="72"/>
+      </w:pPr>
+      <w:r>
+        <w:rPr>
+          <w:b/>
+          <w:bCs/>
+          <w:color w:val="1B3A5C"/>
+        </w:rPr>
+        <w:t xml:space="preserve">Communication </w:t>
+      </w:r>
+      <w:r>
+        <w:rPr>
+          <w:b/>
+          <w:bCs/>
+          <w:color w:val="1B3A5C"/>
+        </w:rPr>
+        <w:t xml:space="preserve">Protocols: </w:t>
+      </w:r>
+      <w:r>
+        <w:t xml:space="preserve">CAN, UART, </w:t>
+      </w:r>
+      <w:r>
+        <w:t xml:space="preserve">SPI, </w:t>
+      </w:r>
+      <w:r>
+        <w:t>I2C, RS232, RS48</w:t>
+      </w:r>
+      <w:r>
+        <w:t>5</w:t>
+      </w:r>
+      <w:r>
+        <w:t xml:space="preserve">, </w:t>
+      </w:r>
+      <w:r>
+        <w:t>MQTT</w:t>
+      </w:r>
+    </w:p>
+    <w:p>
+      <w:pPr>
+        <w:spacing w:before="72" w:after="72"/>
+      </w:pPr>
+      <w:r>
+        <w:rPr>
+          <w:b/>
+          <w:bCs/>
+          <w:color w:val="1B3A5C"/>
+        </w:rPr>
+        <w:t>Wireless &amp; Connectivity:</w:t>
+      </w:r>
+      <w:r>
+        <w:rPr>
+          <w:b/>
+          <w:bCs/>
+        </w:rPr>
+        <w:t xml:space="preserve"> </w:t>
+      </w:r>
+      <w:r>
+        <w:t>Bluetooth, Wi-Fi, GPS, GSM, RFID</w:t>
+      </w:r>
+    </w:p>
+    <w:p>
+      <w:pPr>
+        <w:spacing w:before="72" w:after="72"/>
+      </w:pPr>
+      <w:r>
+        <w:rPr>
+          <w:b/>
+          <w:bCs/>
+          <w:color w:val="1B3A5C"/>
+        </w:rPr>
+        <w:t xml:space="preserve">Embedded </w:t>
+      </w:r>
+      <w:r>
+        <w:rPr>
+          <w:b/>
+          <w:bCs/>
+          <w:color w:val="1B3A5C"/>
+        </w:rPr>
+        <w:t xml:space="preserve">Linux:  </w:t>
+      </w:r>
+      <w:r>
+        <w:t>System Programming, POSIX Threads, Inter-Process Communication (IPC), Character Device Drivers</w:t>
+      </w:r>
+    </w:p>
+    <w:p>
+      <w:pPr>
+        <w:spacing w:before="72" w:after="72"/>
+      </w:pPr>
+      <w:r>
+        <w:rPr>
+          <w:b/>
+          <w:bCs/>
+          <w:color w:val="1B3A5C"/>
+        </w:rPr>
+        <w:t xml:space="preserve">Embedded Systems:  </w:t>
+      </w:r>
+      <w:r>
+        <w:t xml:space="preserve">Firmware Development, </w:t>
+      </w:r>
+      <w:r>
+        <w:t xml:space="preserve">Firmware Validation, </w:t>
+      </w:r>
+      <w:r>
+        <w:t xml:space="preserve">Embedded Software Design, System Integration, </w:t>
+      </w:r>
+      <w:r>
+        <w:t>Debugging</w:t>
+      </w:r>
+      <w:r>
+        <w:t xml:space="preserve">, </w:t>
+      </w:r>
+      <w:r>
+        <w:t>Root Cause Analysis</w:t>
+      </w:r>
+    </w:p>
+    <w:p>
+      <w:pPr>
+        <w:spacing w:before="72" w:after="72"/>
+      </w:pPr>
+      <w:r>
+        <w:rPr>
+          <w:b/>
+          <w:bCs/>
+          <w:color w:val="1B3A5C"/>
+        </w:rPr>
+        <w:t>Testing &amp; Quality:</w:t>
+      </w:r>
+      <w:r>
+        <w:rPr>
+          <w:b/>
+          <w:bCs/>
+          <w:color w:val="1B3A5C"/>
+        </w:rPr>
+        <w:t xml:space="preserve">  </w:t>
+      </w:r>
+      <w:r>
+        <w:t>Unit Testing (Ceedling), Integration Testing, System Testing, Static</w:t>
+      </w:r>
+      <w:r>
+        <w:t xml:space="preserve"> Code</w:t>
+      </w:r>
+      <w:r>
+        <w:t xml:space="preserve"> Analysis (Cppcheck)</w:t>
+      </w:r>
+    </w:p>
+    <w:p>
+      <w:pPr>
+        <w:spacing w:before="72" w:after="72"/>
+      </w:pPr>
+      <w:r>
+        <w:rPr>
+          <w:b/>
+          <w:bCs/>
+          <w:color w:val="1B3A5C"/>
+        </w:rPr>
+        <w:t xml:space="preserve">Tools &amp; IDEs:  </w:t>
+      </w:r>
+      <w:r>
+        <w:t>Git, Gerrit</w:t>
+      </w:r>
+      <w:r>
+        <w:t>, Version control</w:t>
+      </w:r>
+      <w:r>
+        <w:t xml:space="preserve">, JIRA, GDB, JTAG, </w:t>
+      </w:r>
+      <w:r>
+        <w:t>Oscilloscope</w:t>
+      </w:r>
+      <w:r>
+        <w:t>,</w:t>
+      </w:r>
+      <w:r>
+        <w:t xml:space="preserve"> </w:t>
+      </w:r>
+      <w:r>
+        <w:t>Logic Analyzer</w:t>
+      </w:r>
+      <w:r>
+        <w:t xml:space="preserve">, VS Code, Keil MDK, MPLAB X, Atmel Studio, </w:t>
+      </w:r>
+      <w:r>
+        <w:t xml:space="preserve">Code </w:t>
+      </w:r>
+      <w:r>
+        <w:t>Composer Studio</w:t>
+      </w:r>
+      <w:r>
+        <w:t xml:space="preserve"> (CCS)</w:t>
+      </w:r>
+    </w:p>
+    <w:p>
+      <w:pPr>
+        <w:spacing w:before="72" w:after="72"/>
+      </w:pPr>
+    </w:p>
+    <w:p>
+      <w:pPr>
+        <w:pBdr>
+          <w:bottom w:val="single" w:sz="8" w:space="1" w:color="0D7490"/>
+        </w:pBdr>
+        <w:spacing w:before="72" w:after="72"/>
+      </w:pPr>
+      <w:r>
+        <w:rPr>
+          <w:b/>
+          <w:bCs/>
+          <w:color w:val="1B3A5C"/>
+          <w:sz w:val="24"/>
+          <w:szCs w:val="24"/>
+        </w:rPr>
+        <w:t>WORK EXPERIENCE</w:t>
+      </w:r>
       <w:r>
         <w:rPr>
           <w:b/>
@@ -113,372 +472,6 @@
           <w:sz w:val="24"/>
           <w:szCs w:val="24"/>
         </w:rPr>
-        <w:t>PROFILE SUMMARY</w:t>
-      </w:r>
-    </w:p>
-    <w:p>
-      <w:pPr>
-        <w:pStyle w:val="ListParagraph"/>
-        <w:numPr>
-          <w:ilvl w:val="0"/>
-          <w:numId w:val="21"/>
-        </w:numPr>
-        <w:spacing w:before="280" w:after="100"/>
-      </w:pPr>
-      <w:r>
-        <w:t xml:space="preserve">Senior Embedded Firmware Engineer with 6+ years of experience in embedded firmware development, debugging, integration and validation across industrial automation and consumer electronics </w:t>
-      </w:r>
-      <w:r>
-        <w:t>domains. Skilled</w:t>
-      </w:r>
-      <w:r>
-        <w:t xml:space="preserve"> in Embedded C/C++, Zephyr RTOS, Embedded Linux and communication protocols including CAN, SPI, I2C, UART and MQTT. Delivered firmware for three commercial Corsair sim-racing products and received several Bosch awards for quality and delivery excellence.</w:t>
-      </w:r>
-    </w:p>
-    <w:p>
-      <w:pPr>
-        <w:pBdr>
-          <w:bottom w:val="single" w:sz="8" w:space="1" w:color="0D7490"/>
-        </w:pBdr>
-        <w:spacing w:before="280" w:after="100"/>
-        <w:rPr>
-          <w:sz w:val="24"/>
-          <w:szCs w:val="24"/>
-        </w:rPr>
-      </w:pPr>
-      <w:r>
-        <w:rPr>
-          <w:b/>
-          <w:bCs/>
-          <w:caps/>
-          <w:color w:val="1B3A5C"/>
-          <w:spacing w:val="40"/>
-          <w:sz w:val="24"/>
-          <w:szCs w:val="24"/>
-        </w:rPr>
-        <w:t>TECHNICAL SKILLS</w:t>
-      </w:r>
-    </w:p>
-    <w:p>
-      <w:pPr>
-        <w:spacing w:before="72" w:after="72"/>
-      </w:pPr>
-      <w:r>
-        <w:rPr>
-          <w:b/>
-          <w:bCs/>
-          <w:color w:val="1B3A5C"/>
-        </w:rPr>
-        <w:t>Programming Languages</w:t>
-      </w:r>
-      <w:r>
-        <w:rPr>
-          <w:b/>
-          <w:bCs/>
-          <w:color w:val="1B3A5C"/>
-        </w:rPr>
-        <w:t xml:space="preserve">:  </w:t>
-      </w:r>
-      <w:r>
-        <w:t>Embedded C, C++, Shell Script</w:t>
-      </w:r>
-      <w:r>
-        <w:t>ing</w:t>
-      </w:r>
-    </w:p>
-    <w:p>
-      <w:pPr>
-        <w:spacing w:before="72" w:after="72"/>
-      </w:pPr>
-      <w:r>
-        <w:rPr>
-          <w:b/>
-          <w:bCs/>
-          <w:color w:val="1B3A5C"/>
-        </w:rPr>
-        <w:t>RTOS &amp; Operating Systems:</w:t>
-      </w:r>
-      <w:r>
-        <w:rPr>
-          <w:b/>
-          <w:bCs/>
-          <w:color w:val="1B3A5C"/>
-        </w:rPr>
-        <w:t xml:space="preserve">  </w:t>
-      </w:r>
-      <w:r>
-        <w:t>Zephyr RTOS, Embedded Linux</w:t>
-      </w:r>
-    </w:p>
-    <w:p>
-      <w:pPr>
-        <w:spacing w:before="72" w:after="72"/>
-      </w:pPr>
-      <w:r>
-        <w:rPr>
-          <w:b/>
-          <w:bCs/>
-          <w:color w:val="1B3A5C"/>
-        </w:rPr>
-        <w:t xml:space="preserve">Microcontrollers:  </w:t>
-      </w:r>
-      <w:r>
-        <w:t>STM32, TI</w:t>
-      </w:r>
-      <w:r>
-        <w:t xml:space="preserve"> TIVA C</w:t>
-      </w:r>
-      <w:r>
-        <w:t xml:space="preserve">, </w:t>
-      </w:r>
-      <w:r>
-        <w:t>NXP</w:t>
-      </w:r>
-      <w:r>
-        <w:t xml:space="preserve"> LPC Series</w:t>
-      </w:r>
-      <w:r>
-        <w:t>, At</w:t>
-      </w:r>
-      <w:r>
-        <w:t>mel</w:t>
-      </w:r>
-      <w:r>
-        <w:t xml:space="preserve"> AVR/SAM</w:t>
-      </w:r>
-      <w:r>
-        <w:t>, Microchip</w:t>
-      </w:r>
-      <w:r>
-        <w:t xml:space="preserve"> PIC</w:t>
-      </w:r>
-    </w:p>
-    <w:p>
-      <w:pPr>
-        <w:spacing w:before="72" w:after="72"/>
-      </w:pPr>
-      <w:r>
-        <w:rPr>
-          <w:b/>
-          <w:bCs/>
-          <w:color w:val="1B3A5C"/>
-        </w:rPr>
-        <w:t xml:space="preserve">Communication </w:t>
-      </w:r>
-      <w:r>
-        <w:rPr>
-          <w:b/>
-          <w:bCs/>
-          <w:color w:val="1B3A5C"/>
-        </w:rPr>
-        <w:t xml:space="preserve">Protocols: </w:t>
-      </w:r>
-      <w:r>
-        <w:t xml:space="preserve">CAN, UART, </w:t>
-      </w:r>
-      <w:r>
-        <w:t xml:space="preserve">SPI, </w:t>
-      </w:r>
-      <w:r>
-        <w:t>I2C, RS232, RS48</w:t>
-      </w:r>
-      <w:r>
-        <w:t>5</w:t>
-      </w:r>
-      <w:r>
-        <w:t xml:space="preserve">, </w:t>
-      </w:r>
-      <w:r>
-        <w:t>MQTT</w:t>
-      </w:r>
-    </w:p>
-    <w:p>
-      <w:pPr>
-        <w:spacing w:before="72" w:after="72"/>
-      </w:pPr>
-      <w:r>
-        <w:rPr>
-          <w:b/>
-          <w:bCs/>
-          <w:color w:val="1B3A5C"/>
-        </w:rPr>
-        <w:t>Wireless &amp; Connectivity:</w:t>
-      </w:r>
-      <w:r>
-        <w:rPr>
-          <w:b/>
-          <w:bCs/>
-        </w:rPr>
-        <w:t xml:space="preserve"> </w:t>
-      </w:r>
-      <w:r>
-        <w:t>Bluetooth, Wi-Fi, GPS, GSM, RFID</w:t>
-      </w:r>
-    </w:p>
-    <w:p>
-      <w:pPr>
-        <w:spacing w:before="72" w:after="72"/>
-      </w:pPr>
-      <w:r>
-        <w:rPr>
-          <w:b/>
-          <w:bCs/>
-          <w:color w:val="1B3A5C"/>
-        </w:rPr>
-        <w:t xml:space="preserve">Embedded </w:t>
-      </w:r>
-      <w:r>
-        <w:rPr>
-          <w:b/>
-          <w:bCs/>
-          <w:color w:val="1B3A5C"/>
-        </w:rPr>
-        <w:t xml:space="preserve">Linux:  </w:t>
-      </w:r>
-      <w:r>
-        <w:t>System Programming, POSIX Threads, Inter-Process Communication (IPC), Character Device Drivers</w:t>
-      </w:r>
-    </w:p>
-    <w:p>
-      <w:pPr>
-        <w:spacing w:before="72" w:after="72"/>
-      </w:pPr>
-      <w:r>
-        <w:rPr>
-          <w:b/>
-          <w:bCs/>
-          <w:color w:val="1B3A5C"/>
-        </w:rPr>
-        <w:t xml:space="preserve">Embedded Systems:  </w:t>
-      </w:r>
-      <w:r>
-        <w:t xml:space="preserve">Firmware Development, </w:t>
-      </w:r>
-      <w:r>
-        <w:t xml:space="preserve">Firmware Validation, </w:t>
-      </w:r>
-      <w:r>
-        <w:t xml:space="preserve">Embedded Software Design, System Integration, </w:t>
-      </w:r>
-      <w:r>
-        <w:t>Debugging</w:t>
-      </w:r>
-      <w:r>
-        <w:t xml:space="preserve">, </w:t>
-      </w:r>
-      <w:r>
-        <w:t>Root Cause Analysis</w:t>
-      </w:r>
-    </w:p>
-    <w:p>
-      <w:pPr>
-        <w:spacing w:before="72" w:after="72"/>
-      </w:pPr>
-      <w:r>
-        <w:rPr>
-          <w:b/>
-          <w:bCs/>
-          <w:color w:val="1B3A5C"/>
-        </w:rPr>
-        <w:t>Testing &amp; Quality:</w:t>
-      </w:r>
-      <w:r>
-        <w:rPr>
-          <w:b/>
-          <w:bCs/>
-          <w:color w:val="1B3A5C"/>
-        </w:rPr>
-        <w:t xml:space="preserve">  </w:t>
-      </w:r>
-      <w:r>
-        <w:t>Unit Testing (Ceedling), Integration Testing, System Testing, Static</w:t>
-      </w:r>
-      <w:r>
-        <w:t xml:space="preserve"> Code</w:t>
-      </w:r>
-      <w:r>
-        <w:t xml:space="preserve"> Analysis (Cppcheck)</w:t>
-      </w:r>
-    </w:p>
-    <w:p>
-      <w:pPr>
-        <w:spacing w:before="72" w:after="72"/>
-      </w:pPr>
-      <w:r>
-        <w:rPr>
-          <w:b/>
-          <w:bCs/>
-          <w:color w:val="1B3A5C"/>
-        </w:rPr>
-        <w:t xml:space="preserve">Tools &amp; IDEs:  </w:t>
-      </w:r>
-      <w:r>
-        <w:t>Git, Gerrit</w:t>
-      </w:r>
-      <w:r>
-        <w:t>, Version control</w:t>
-      </w:r>
-      <w:r>
-        <w:t xml:space="preserve">, JIRA, GDB, JTAG, </w:t>
-      </w:r>
-      <w:r>
-        <w:t>Oscilloscope</w:t>
-      </w:r>
-      <w:r>
-        <w:t>,</w:t>
-      </w:r>
-      <w:r>
-        <w:t xml:space="preserve"> </w:t>
-      </w:r>
-      <w:r>
-        <w:t>Logic Analyzer</w:t>
-      </w:r>
-      <w:r>
-        <w:t xml:space="preserve">, VS Code, Keil MDK, MPLAB X, Atmel Studio, </w:t>
-      </w:r>
-      <w:r>
-        <w:t xml:space="preserve">Code </w:t>
-      </w:r>
-      <w:r>
-        <w:t>Composer Studio</w:t>
-      </w:r>
-      <w:r>
-        <w:t xml:space="preserve"> (CCS)</w:t>
-      </w:r>
-    </w:p>
-    <w:p>
-      <w:pPr>
-        <w:pBdr>
-          <w:bottom w:val="single" w:sz="8" w:space="1" w:color="0D7490"/>
-        </w:pBdr>
-        <w:spacing w:before="280" w:after="100"/>
-        <w:rPr>
-          <w:sz w:val="24"/>
-          <w:szCs w:val="24"/>
-        </w:rPr>
-      </w:pPr>
-      <w:r>
-        <w:rPr>
-          <w:b/>
-          <w:bCs/>
-          <w:caps/>
-          <w:color w:val="1B3A5C"/>
-          <w:spacing w:val="40"/>
-          <w:sz w:val="24"/>
-          <w:szCs w:val="24"/>
-        </w:rPr>
-        <w:t>WORK EXPERIENCE</w:t>
-      </w:r>
-      <w:r>
-        <w:rPr>
-          <w:b/>
-          <w:bCs/>
-          <w:caps/>
-          <w:color w:val="1B3A5C"/>
-          <w:spacing w:val="40"/>
-          <w:sz w:val="24"/>
-          <w:szCs w:val="24"/>
-        </w:rPr>
         <w:tab/>
       </w:r>
     </w:p>
@@ -497,7 +490,37 @@
           <w:sz w:val="22"/>
           <w:szCs w:val="22"/>
         </w:rPr>
+        <w:t xml:space="preserve">Analyst </w:t>
+      </w:r>
+      <w:r>
+        <w:rPr>
+          <w:b/>
+          <w:bCs/>
+          <w:color w:val="1B3A5C"/>
+          <w:sz w:val="22"/>
+          <w:szCs w:val="22"/>
+        </w:rPr>
+        <w:t>(</w:t>
+      </w:r>
+      <w:r>
+        <w:rPr>
+          <w:b/>
+          <w:bCs/>
+          <w:color w:val="1B3A5C"/>
+          <w:sz w:val="22"/>
+          <w:szCs w:val="22"/>
+        </w:rPr>
         <w:t>Senior Embedded Firmware Engineer</w:t>
+      </w:r>
+      <w:r>
+        <w:rPr>
+          <w:b/>
+          <w:bCs/>
+          <w:color w:val="1B3A5C"/>
+          <w:sz w:val="22"/>
+          <w:szCs w:val="22"/>
+        </w:rPr>
+        <w:t>)</w:t>
       </w:r>
       <w:r>
         <w:rPr>
@@ -512,8 +535,10 @@
       <w:r>
         <w:rPr>
           <w:color w:val="52637A"/>
-        </w:rPr>
-        <w:t xml:space="preserve">  </w:t>
+          <w:sz w:val="21"/>
+          <w:szCs w:val="21"/>
+        </w:rPr>
+        <w:t>|</w:t>
       </w:r>
       <w:r>
         <w:rPr>
@@ -521,7 +546,7 @@
           <w:sz w:val="21"/>
           <w:szCs w:val="21"/>
         </w:rPr>
-        <w:t xml:space="preserve">|  </w:t>
+        <w:t xml:space="preserve"> </w:t>
       </w:r>
       <w:r>
         <w:rPr>
@@ -543,7 +568,7 @@
           <w:sz w:val="21"/>
           <w:szCs w:val="21"/>
         </w:rPr>
-        <w:t xml:space="preserve">  </w:t>
+        <w:t xml:space="preserve"> </w:t>
       </w:r>
       <w:r>
         <w:rPr>
@@ -574,7 +599,7 @@
         <w:pStyle w:val="ListParagraph"/>
         <w:numPr>
           <w:ilvl w:val="0"/>
-          <w:numId w:val="11"/>
+          <w:numId w:val="22"/>
         </w:numPr>
         <w:spacing w:before="58" w:after="58"/>
       </w:pPr>
@@ -587,12 +612,27 @@
         <w:pStyle w:val="ListParagraph"/>
         <w:numPr>
           <w:ilvl w:val="0"/>
-          <w:numId w:val="11"/>
+          <w:numId w:val="22"/>
         </w:numPr>
         <w:spacing w:before="58" w:after="58"/>
       </w:pPr>
       <w:r>
-        <w:t>Supported firmware maintenance and long-term product sustainability across multiple Corsair product lines through defect resolution, root cause analysis, regression testing, as well as feature enhancements, improving product stability and reliability.</w:t>
+        <w:t>Resolved 2</w:t>
+      </w:r>
+      <w:r>
+        <w:t>1</w:t>
+      </w:r>
+      <w:r>
+        <w:t>+ defects across</w:t>
+      </w:r>
+      <w:r>
+        <w:t xml:space="preserve"> </w:t>
+      </w:r>
+      <w:r>
+        <w:t>4</w:t>
+      </w:r>
+      <w:r>
+        <w:t xml:space="preserve"> Corsair product lines through defect resolution, root cause analysis, regression testing, as well as feature enhancements, improving product stability and reliability.</w:t>
       </w:r>
     </w:p>
     <w:p>
@@ -600,12 +640,18 @@
         <w:pStyle w:val="ListParagraph"/>
         <w:numPr>
           <w:ilvl w:val="0"/>
-          <w:numId w:val="11"/>
+          <w:numId w:val="22"/>
         </w:numPr>
         <w:spacing w:before="58" w:after="58"/>
       </w:pPr>
       <w:r>
-        <w:t>Led and mentored a team of two junior firmware engineers, providing technical guidance, task planning, code reviews, and project onboarding support.</w:t>
+        <w:t xml:space="preserve">Led and mentored a team of </w:t>
+      </w:r>
+      <w:r>
+        <w:t>2</w:t>
+      </w:r>
+      <w:r>
+        <w:t xml:space="preserve"> junior firmware engineers, providing technical guidance, task planning, code reviews, and project onboarding support.</w:t>
       </w:r>
     </w:p>
     <w:p>
@@ -679,7 +725,7 @@
         <w:pStyle w:val="ListParagraph"/>
         <w:numPr>
           <w:ilvl w:val="0"/>
-          <w:numId w:val="16"/>
+          <w:numId w:val="23"/>
         </w:numPr>
         <w:tabs>
           <w:tab w:val="right" w:pos="9026"/>
@@ -695,7 +741,7 @@
         <w:pStyle w:val="ListParagraph"/>
         <w:numPr>
           <w:ilvl w:val="0"/>
-          <w:numId w:val="16"/>
+          <w:numId w:val="23"/>
         </w:numPr>
         <w:tabs>
           <w:tab w:val="right" w:pos="9026"/>
@@ -711,7 +757,7 @@
         <w:pStyle w:val="ListParagraph"/>
         <w:numPr>
           <w:ilvl w:val="0"/>
-          <w:numId w:val="16"/>
+          <w:numId w:val="23"/>
         </w:numPr>
         <w:tabs>
           <w:tab w:val="right" w:pos="9026"/>
@@ -719,8 +765,16 @@
         <w:spacing w:before="160" w:after="38"/>
       </w:pPr>
       <w:r>
-        <w:t>Improved code organization and maintainability by restructuring the project using Git submodules.</w:t>
-      </w:r>
+        <w:t>Improved code organization and maintainability by restructuring the project using Git submodules and contributing to release validation activities.</w:t>
+      </w:r>
+    </w:p>
+    <w:p>
+      <w:pPr>
+        <w:tabs>
+          <w:tab w:val="right" w:pos="9026"/>
+        </w:tabs>
+        <w:spacing w:before="160" w:after="38"/>
+      </w:pPr>
     </w:p>
     <w:p>
       <w:pPr>
@@ -810,7 +864,7 @@
         <w:pStyle w:val="ListParagraph"/>
         <w:numPr>
           <w:ilvl w:val="0"/>
-          <w:numId w:val="16"/>
+          <w:numId w:val="24"/>
         </w:numPr>
         <w:tabs>
           <w:tab w:val="right" w:pos="9026"/>
@@ -818,7 +872,22 @@
         <w:spacing w:before="160" w:after="38"/>
       </w:pPr>
       <w:r>
-        <w:t>Served as the sole firmware engineer for a three-layer conveyor system, responsible for firmware development, system integration, testing, and on-site deployment of a textile automation solution.</w:t>
+        <w:t xml:space="preserve">Sole firmware engineer for a Three-Layer Conveyor System </w:t>
+      </w:r>
+      <w:r>
+        <w:t>(</w:t>
+      </w:r>
+      <w:r>
+        <w:t xml:space="preserve">textile </w:t>
+      </w:r>
+      <w:r>
+        <w:t>automation)</w:t>
+      </w:r>
+      <w:r>
+        <w:t xml:space="preserve"> delivered firmware development, system integration, testing, and on-site deployment end-to-end in under 4 months</w:t>
+      </w:r>
+      <w:r>
+        <w:t>.</w:t>
       </w:r>
     </w:p>
     <w:p>
@@ -826,7 +895,7 @@
         <w:pStyle w:val="ListParagraph"/>
         <w:numPr>
           <w:ilvl w:val="0"/>
-          <w:numId w:val="16"/>
+          <w:numId w:val="24"/>
         </w:numPr>
         <w:tabs>
           <w:tab w:val="right" w:pos="9026"/>
@@ -842,7 +911,7 @@
         <w:pStyle w:val="ListParagraph"/>
         <w:numPr>
           <w:ilvl w:val="0"/>
-          <w:numId w:val="16"/>
+          <w:numId w:val="24"/>
         </w:numPr>
         <w:tabs>
           <w:tab w:val="right" w:pos="9026"/>
@@ -850,7 +919,16 @@
         <w:spacing w:before="160" w:after="38"/>
       </w:pPr>
       <w:r>
-        <w:t>Designed and validated a pulse oximeter proof-of-concept using the MAX30100 sensor, implementing SpO₂ and heart-rate measurement algorithms.</w:t>
+        <w:t>Designed and validated a pulse oximeter proof-of-concept using the MAX30100 sensor, implementing SpO₂ and heart-rate measurement algorithms</w:t>
+      </w:r>
+      <w:r>
+        <w:t xml:space="preserve"> </w:t>
+      </w:r>
+      <w:r>
+        <w:t>with ±2% accuracy</w:t>
+      </w:r>
+      <w:r>
+        <w:t>.</w:t>
       </w:r>
       <w:r>
         <w:tab/>
@@ -863,6 +941,9 @@
         </w:pBdr>
         <w:spacing w:before="280" w:after="100"/>
         <w:rPr>
+          <w:b/>
+          <w:bCs/>
+          <w:color w:val="1B3A5C"/>
           <w:sz w:val="24"/>
           <w:szCs w:val="24"/>
         </w:rPr>
@@ -871,9 +952,7 @@
         <w:rPr>
           <w:b/>
           <w:bCs/>
-          <w:caps/>
           <w:color w:val="1B3A5C"/>
-          <w:spacing w:val="40"/>
           <w:sz w:val="24"/>
           <w:szCs w:val="24"/>
         </w:rPr>
@@ -977,7 +1056,7 @@
         <w:pStyle w:val="ListParagraph"/>
         <w:numPr>
           <w:ilvl w:val="0"/>
-          <w:numId w:val="16"/>
+          <w:numId w:val="25"/>
         </w:numPr>
         <w:tabs>
           <w:tab w:val="right" w:pos="9026"/>
@@ -993,7 +1072,7 @@
         <w:pStyle w:val="ListParagraph"/>
         <w:numPr>
           <w:ilvl w:val="0"/>
-          <w:numId w:val="16"/>
+          <w:numId w:val="25"/>
         </w:numPr>
         <w:tabs>
           <w:tab w:val="right" w:pos="9026"/>
@@ -1095,7 +1174,7 @@
         <w:pStyle w:val="ListParagraph"/>
         <w:numPr>
           <w:ilvl w:val="0"/>
-          <w:numId w:val="16"/>
+          <w:numId w:val="26"/>
         </w:numPr>
         <w:tabs>
           <w:tab w:val="right" w:pos="9026"/>
@@ -1111,7 +1190,7 @@
         <w:pStyle w:val="ListParagraph"/>
         <w:numPr>
           <w:ilvl w:val="0"/>
-          <w:numId w:val="16"/>
+          <w:numId w:val="26"/>
         </w:numPr>
         <w:tabs>
           <w:tab w:val="right" w:pos="9026"/>
@@ -1188,7 +1267,7 @@
         <w:pStyle w:val="ListParagraph"/>
         <w:numPr>
           <w:ilvl w:val="0"/>
-          <w:numId w:val="16"/>
+          <w:numId w:val="27"/>
         </w:numPr>
         <w:tabs>
           <w:tab w:val="right" w:pos="9026"/>
@@ -1201,27 +1280,14 @@
     </w:p>
     <w:p>
       <w:pPr>
-        <w:pStyle w:val="ListParagraph"/>
-        <w:numPr>
-          <w:ilvl w:val="0"/>
-          <w:numId w:val="16"/>
-        </w:numPr>
-        <w:tabs>
-          <w:tab w:val="right" w:pos="9026"/>
-        </w:tabs>
-        <w:spacing w:before="160" w:after="38"/>
-      </w:pPr>
-      <w:r>
-        <w:t>Improved code organization and maintainability by restructuring the project using Git submodules and contributing to release validation activities.</w:t>
-      </w:r>
-    </w:p>
-    <w:p>
-      <w:pPr>
         <w:pBdr>
           <w:bottom w:val="single" w:sz="8" w:space="1" w:color="0D7490"/>
         </w:pBdr>
         <w:spacing w:before="280" w:after="100"/>
         <w:rPr>
+          <w:b/>
+          <w:bCs/>
+          <w:color w:val="1B3A5C"/>
           <w:sz w:val="24"/>
           <w:szCs w:val="24"/>
         </w:rPr>
@@ -1230,9 +1296,7 @@
         <w:rPr>
           <w:b/>
           <w:bCs/>
-          <w:caps/>
           <w:color w:val="1B3A5C"/>
-          <w:spacing w:val="40"/>
           <w:sz w:val="24"/>
           <w:szCs w:val="24"/>
         </w:rPr>
@@ -1241,11 +1305,6 @@
     </w:p>
     <w:p>
       <w:pPr>
-        <w:pStyle w:val="ListParagraph"/>
-        <w:numPr>
-          <w:ilvl w:val="0"/>
-          <w:numId w:val="3"/>
-        </w:numPr>
         <w:spacing w:before="88" w:after="88"/>
         <w:rPr>
           <w:sz w:val="22"/>
@@ -1288,11 +1347,6 @@
     </w:p>
     <w:p>
       <w:pPr>
-        <w:pStyle w:val="ListParagraph"/>
-        <w:numPr>
-          <w:ilvl w:val="0"/>
-          <w:numId w:val="3"/>
-        </w:numPr>
         <w:spacing w:before="88" w:after="88"/>
         <w:rPr>
           <w:sz w:val="22"/>
@@ -1335,11 +1389,6 @@
     </w:p>
     <w:p>
       <w:pPr>
-        <w:pStyle w:val="ListParagraph"/>
-        <w:numPr>
-          <w:ilvl w:val="0"/>
-          <w:numId w:val="3"/>
-        </w:numPr>
         <w:spacing w:before="88" w:after="88"/>
         <w:rPr>
           <w:sz w:val="22"/>
@@ -1387,6 +1436,9 @@
         </w:pBdr>
         <w:spacing w:before="280" w:after="100"/>
         <w:rPr>
+          <w:b/>
+          <w:bCs/>
+          <w:color w:val="1B3A5C"/>
           <w:sz w:val="24"/>
           <w:szCs w:val="24"/>
         </w:rPr>
@@ -1395,9 +1447,7 @@
         <w:rPr>
           <w:b/>
           <w:bCs/>
-          <w:caps/>
           <w:color w:val="1B3A5C"/>
-          <w:spacing w:val="40"/>
           <w:sz w:val="24"/>
           <w:szCs w:val="24"/>
         </w:rPr>
@@ -1574,6 +1624,119 @@
     </w:lvl>
   </w:abstractNum>
   <w:abstractNum w:abstractNumId="1" w15:restartNumberingAfterBreak="0">
+    <w:nsid w:val="13FA1378"/>
+    <w:multiLevelType w:val="hybridMultilevel"/>
+    <w:tmpl w:val="130AE1E2"/>
+    <w:lvl w:ilvl="0" w:tplc="04090001">
+      <w:start w:val="1"/>
+      <w:numFmt w:val="bullet"/>
+      <w:lvlText w:val=""/>
+      <w:lvlJc w:val="left"/>
+      <w:pPr>
+        <w:ind w:left="720" w:hanging="360"/>
+      </w:pPr>
+      <w:rPr>
+        <w:rFonts w:ascii="Symbol" w:hAnsi="Symbol" w:hint="default"/>
+      </w:rPr>
+    </w:lvl>
+    <w:lvl w:ilvl="1" w:tplc="04090003" w:tentative="1">
+      <w:start w:val="1"/>
+      <w:numFmt w:val="bullet"/>
+      <w:lvlText w:val="o"/>
+      <w:lvlJc w:val="left"/>
+      <w:pPr>
+        <w:ind w:left="1440" w:hanging="360"/>
+      </w:pPr>
+      <w:rPr>
+        <w:rFonts w:ascii="Courier New" w:hAnsi="Courier New" w:cs="Courier New" w:hint="default"/>
+      </w:rPr>
+    </w:lvl>
+    <w:lvl w:ilvl="2" w:tplc="04090005" w:tentative="1">
+      <w:start w:val="1"/>
+      <w:numFmt w:val="bullet"/>
+      <w:lvlText w:val=""/>
+      <w:lvlJc w:val="left"/>
+      <w:pPr>
+        <w:ind w:left="2160" w:hanging="360"/>
+      </w:pPr>
+      <w:rPr>
+        <w:rFonts w:ascii="Wingdings" w:hAnsi="Wingdings" w:hint="default"/>
+      </w:rPr>
+    </w:lvl>
+    <w:lvl w:ilvl="3" w:tplc="04090001" w:tentative="1">
+      <w:start w:val="1"/>
+      <w:numFmt w:val="bullet"/>
+      <w:lvlText w:val=""/>
+      <w:lvlJc w:val="left"/>
+      <w:pPr>
+        <w:ind w:left="2880" w:hanging="360"/>
+      </w:pPr>
+      <w:rPr>
+        <w:rFonts w:ascii="Symbol" w:hAnsi="Symbol" w:hint="default"/>
+      </w:rPr>
+    </w:lvl>
+    <w:lvl w:ilvl="4" w:tplc="04090003" w:tentative="1">
+      <w:start w:val="1"/>
+      <w:numFmt w:val="bullet"/>
+      <w:lvlText w:val="o"/>
+      <w:lvlJc w:val="left"/>
+      <w:pPr>
+        <w:ind w:left="3600" w:hanging="360"/>
+      </w:pPr>
+      <w:rPr>
+        <w:rFonts w:ascii="Courier New" w:hAnsi="Courier New" w:cs="Courier New" w:hint="default"/>
+      </w:rPr>
+    </w:lvl>
+    <w:lvl w:ilvl="5" w:tplc="04090005" w:tentative="1">
+      <w:start w:val="1"/>
+      <w:numFmt w:val="bullet"/>
+      <w:lvlText w:val=""/>
+      <w:lvlJc w:val="left"/>
+      <w:pPr>
+        <w:ind w:left="4320" w:hanging="360"/>
+      </w:pPr>
+      <w:rPr>
+        <w:rFonts w:ascii="Wingdings" w:hAnsi="Wingdings" w:hint="default"/>
+      </w:rPr>
+    </w:lvl>
+    <w:lvl w:ilvl="6" w:tplc="04090001" w:tentative="1">
+      <w:start w:val="1"/>
+      <w:numFmt w:val="bullet"/>
+      <w:lvlText w:val=""/>
+      <w:lvlJc w:val="left"/>
+      <w:pPr>
+        <w:ind w:left="5040" w:hanging="360"/>
+      </w:pPr>
+      <w:rPr>
+        <w:rFonts w:ascii="Symbol" w:hAnsi="Symbol" w:hint="default"/>
+      </w:rPr>
+    </w:lvl>
+    <w:lvl w:ilvl="7" w:tplc="04090003" w:tentative="1">
+      <w:start w:val="1"/>
+      <w:numFmt w:val="bullet"/>
+      <w:lvlText w:val="o"/>
+      <w:lvlJc w:val="left"/>
+      <w:pPr>
+        <w:ind w:left="5760" w:hanging="360"/>
+      </w:pPr>
+      <w:rPr>
+        <w:rFonts w:ascii="Courier New" w:hAnsi="Courier New" w:cs="Courier New" w:hint="default"/>
+      </w:rPr>
+    </w:lvl>
+    <w:lvl w:ilvl="8" w:tplc="04090005" w:tentative="1">
+      <w:start w:val="1"/>
+      <w:numFmt w:val="bullet"/>
+      <w:lvlText w:val=""/>
+      <w:lvlJc w:val="left"/>
+      <w:pPr>
+        <w:ind w:left="6480" w:hanging="360"/>
+      </w:pPr>
+      <w:rPr>
+        <w:rFonts w:ascii="Wingdings" w:hAnsi="Wingdings" w:hint="default"/>
+      </w:rPr>
+    </w:lvl>
+  </w:abstractNum>
+  <w:abstractNum w:abstractNumId="2" w15:restartNumberingAfterBreak="0">
     <w:nsid w:val="15156C0F"/>
     <w:multiLevelType w:val="hybridMultilevel"/>
     <w:tmpl w:val="9972500A"/>
@@ -1683,7 +1846,7 @@
       </w:rPr>
     </w:lvl>
   </w:abstractNum>
-  <w:abstractNum w:abstractNumId="2" w15:restartNumberingAfterBreak="0">
+  <w:abstractNum w:abstractNumId="3" w15:restartNumberingAfterBreak="0">
     <w:nsid w:val="1DB863F9"/>
     <w:multiLevelType w:val="hybridMultilevel"/>
     <w:tmpl w:val="35DA3C46"/>
@@ -1796,7 +1959,120 @@
       </w:rPr>
     </w:lvl>
   </w:abstractNum>
-  <w:abstractNum w:abstractNumId="3" w15:restartNumberingAfterBreak="0">
+  <w:abstractNum w:abstractNumId="4" w15:restartNumberingAfterBreak="0">
+    <w:nsid w:val="21903C11"/>
+    <w:multiLevelType w:val="hybridMultilevel"/>
+    <w:tmpl w:val="2546467E"/>
+    <w:lvl w:ilvl="0" w:tplc="04090001">
+      <w:start w:val="1"/>
+      <w:numFmt w:val="bullet"/>
+      <w:lvlText w:val=""/>
+      <w:lvlJc w:val="left"/>
+      <w:pPr>
+        <w:ind w:left="720" w:hanging="360"/>
+      </w:pPr>
+      <w:rPr>
+        <w:rFonts w:ascii="Symbol" w:hAnsi="Symbol" w:hint="default"/>
+      </w:rPr>
+    </w:lvl>
+    <w:lvl w:ilvl="1" w:tplc="FFFFFFFF" w:tentative="1">
+      <w:start w:val="1"/>
+      <w:numFmt w:val="bullet"/>
+      <w:lvlText w:val="o"/>
+      <w:lvlJc w:val="left"/>
+      <w:pPr>
+        <w:ind w:left="1440" w:hanging="360"/>
+      </w:pPr>
+      <w:rPr>
+        <w:rFonts w:ascii="Courier New" w:hAnsi="Courier New" w:cs="Courier New" w:hint="default"/>
+      </w:rPr>
+    </w:lvl>
+    <w:lvl w:ilvl="2" w:tplc="FFFFFFFF" w:tentative="1">
+      <w:start w:val="1"/>
+      <w:numFmt w:val="bullet"/>
+      <w:lvlText w:val=""/>
+      <w:lvlJc w:val="left"/>
+      <w:pPr>
+        <w:ind w:left="2160" w:hanging="360"/>
+      </w:pPr>
+      <w:rPr>
+        <w:rFonts w:ascii="Wingdings" w:hAnsi="Wingdings" w:hint="default"/>
+      </w:rPr>
+    </w:lvl>
+    <w:lvl w:ilvl="3" w:tplc="FFFFFFFF" w:tentative="1">
+      <w:start w:val="1"/>
+      <w:numFmt w:val="bullet"/>
+      <w:lvlText w:val=""/>
+      <w:lvlJc w:val="left"/>
+      <w:pPr>
+        <w:ind w:left="2880" w:hanging="360"/>
+      </w:pPr>
+      <w:rPr>
+        <w:rFonts w:ascii="Symbol" w:hAnsi="Symbol" w:hint="default"/>
+      </w:rPr>
+    </w:lvl>
+    <w:lvl w:ilvl="4" w:tplc="FFFFFFFF" w:tentative="1">
+      <w:start w:val="1"/>
+      <w:numFmt w:val="bullet"/>
+      <w:lvlText w:val="o"/>
+      <w:lvlJc w:val="left"/>
+      <w:pPr>
+        <w:ind w:left="3600" w:hanging="360"/>
+      </w:pPr>
+      <w:rPr>
+        <w:rFonts w:ascii="Courier New" w:hAnsi="Courier New" w:cs="Courier New" w:hint="default"/>
+      </w:rPr>
+    </w:lvl>
+    <w:lvl w:ilvl="5" w:tplc="FFFFFFFF" w:tentative="1">
+      <w:start w:val="1"/>
+      <w:numFmt w:val="bullet"/>
+      <w:lvlText w:val=""/>
+      <w:lvlJc w:val="left"/>
+      <w:pPr>
+        <w:ind w:left="4320" w:hanging="360"/>
+      </w:pPr>
+      <w:rPr>
+        <w:rFonts w:ascii="Wingdings" w:hAnsi="Wingdings" w:hint="default"/>
+      </w:rPr>
+    </w:lvl>
+    <w:lvl w:ilvl="6" w:tplc="FFFFFFFF" w:tentative="1">
+      <w:start w:val="1"/>
+      <w:numFmt w:val="bullet"/>
+      <w:lvlText w:val=""/>
+      <w:lvlJc w:val="left"/>
+      <w:pPr>
+        <w:ind w:left="5040" w:hanging="360"/>
+      </w:pPr>
+      <w:rPr>
+        <w:rFonts w:ascii="Symbol" w:hAnsi="Symbol" w:hint="default"/>
+      </w:rPr>
+    </w:lvl>
+    <w:lvl w:ilvl="7" w:tplc="FFFFFFFF" w:tentative="1">
+      <w:start w:val="1"/>
+      <w:numFmt w:val="bullet"/>
+      <w:lvlText w:val="o"/>
+      <w:lvlJc w:val="left"/>
+      <w:pPr>
+        <w:ind w:left="5760" w:hanging="360"/>
+      </w:pPr>
+      <w:rPr>
+        <w:rFonts w:ascii="Courier New" w:hAnsi="Courier New" w:cs="Courier New" w:hint="default"/>
+      </w:rPr>
+    </w:lvl>
+    <w:lvl w:ilvl="8" w:tplc="FFFFFFFF" w:tentative="1">
+      <w:start w:val="1"/>
+      <w:numFmt w:val="bullet"/>
+      <w:lvlText w:val=""/>
+      <w:lvlJc w:val="left"/>
+      <w:pPr>
+        <w:ind w:left="6480" w:hanging="360"/>
+      </w:pPr>
+      <w:rPr>
+        <w:rFonts w:ascii="Wingdings" w:hAnsi="Wingdings" w:hint="default"/>
+      </w:rPr>
+    </w:lvl>
+  </w:abstractNum>
+  <w:abstractNum w:abstractNumId="5" w15:restartNumberingAfterBreak="0">
     <w:nsid w:val="2C8C2EAE"/>
     <w:multiLevelType w:val="hybridMultilevel"/>
     <w:tmpl w:val="4394075E"/>
@@ -1909,7 +2185,7 @@
       </w:rPr>
     </w:lvl>
   </w:abstractNum>
-  <w:abstractNum w:abstractNumId="4" w15:restartNumberingAfterBreak="0">
+  <w:abstractNum w:abstractNumId="6" w15:restartNumberingAfterBreak="0">
     <w:nsid w:val="2FF3390D"/>
     <w:multiLevelType w:val="hybridMultilevel"/>
     <w:tmpl w:val="BE4C13CE"/>
@@ -1995,7 +2271,7 @@
       </w:pPr>
     </w:lvl>
   </w:abstractNum>
-  <w:abstractNum w:abstractNumId="5" w15:restartNumberingAfterBreak="0">
+  <w:abstractNum w:abstractNumId="7" w15:restartNumberingAfterBreak="0">
     <w:nsid w:val="305A1EB6"/>
     <w:multiLevelType w:val="hybridMultilevel"/>
     <w:tmpl w:val="AF527258"/>
@@ -2107,7 +2383,7 @@
       </w:rPr>
     </w:lvl>
   </w:abstractNum>
-  <w:abstractNum w:abstractNumId="6" w15:restartNumberingAfterBreak="0">
+  <w:abstractNum w:abstractNumId="8" w15:restartNumberingAfterBreak="0">
     <w:nsid w:val="313E4CCF"/>
     <w:multiLevelType w:val="hybridMultilevel"/>
     <w:tmpl w:val="CE7E36B0"/>
@@ -2220,7 +2496,7 @@
       </w:rPr>
     </w:lvl>
   </w:abstractNum>
-  <w:abstractNum w:abstractNumId="7" w15:restartNumberingAfterBreak="0">
+  <w:abstractNum w:abstractNumId="9" w15:restartNumberingAfterBreak="0">
     <w:nsid w:val="35A66DDF"/>
     <w:multiLevelType w:val="hybridMultilevel"/>
     <w:tmpl w:val="8176F268"/>
@@ -2333,7 +2609,7 @@
       </w:rPr>
     </w:lvl>
   </w:abstractNum>
-  <w:abstractNum w:abstractNumId="8" w15:restartNumberingAfterBreak="0">
+  <w:abstractNum w:abstractNumId="10" w15:restartNumberingAfterBreak="0">
     <w:nsid w:val="477F2829"/>
     <w:multiLevelType w:val="hybridMultilevel"/>
     <w:tmpl w:val="AE603692"/>
@@ -2446,7 +2722,120 @@
       </w:rPr>
     </w:lvl>
   </w:abstractNum>
-  <w:abstractNum w:abstractNumId="9" w15:restartNumberingAfterBreak="0">
+  <w:abstractNum w:abstractNumId="11" w15:restartNumberingAfterBreak="0">
+    <w:nsid w:val="4A8C2751"/>
+    <w:multiLevelType w:val="hybridMultilevel"/>
+    <w:tmpl w:val="0D444F84"/>
+    <w:lvl w:ilvl="0" w:tplc="04090001">
+      <w:start w:val="1"/>
+      <w:numFmt w:val="bullet"/>
+      <w:lvlText w:val=""/>
+      <w:lvlJc w:val="left"/>
+      <w:pPr>
+        <w:ind w:left="360" w:hanging="360"/>
+      </w:pPr>
+      <w:rPr>
+        <w:rFonts w:ascii="Symbol" w:hAnsi="Symbol" w:hint="default"/>
+      </w:rPr>
+    </w:lvl>
+    <w:lvl w:ilvl="1" w:tplc="04090003" w:tentative="1">
+      <w:start w:val="1"/>
+      <w:numFmt w:val="bullet"/>
+      <w:lvlText w:val="o"/>
+      <w:lvlJc w:val="left"/>
+      <w:pPr>
+        <w:ind w:left="1080" w:hanging="360"/>
+      </w:pPr>
+      <w:rPr>
+        <w:rFonts w:ascii="Courier New" w:hAnsi="Courier New" w:cs="Courier New" w:hint="default"/>
+      </w:rPr>
+    </w:lvl>
+    <w:lvl w:ilvl="2" w:tplc="04090005" w:tentative="1">
+      <w:start w:val="1"/>
+      <w:numFmt w:val="bullet"/>
+      <w:lvlText w:val=""/>
+      <w:lvlJc w:val="left"/>
+      <w:pPr>
+        <w:ind w:left="1800" w:hanging="360"/>
+      </w:pPr>
+      <w:rPr>
+        <w:rFonts w:ascii="Wingdings" w:hAnsi="Wingdings" w:hint="default"/>
+      </w:rPr>
+    </w:lvl>
+    <w:lvl w:ilvl="3" w:tplc="04090001" w:tentative="1">
+      <w:start w:val="1"/>
+      <w:numFmt w:val="bullet"/>
+      <w:lvlText w:val=""/>
+      <w:lvlJc w:val="left"/>
+      <w:pPr>
+        <w:ind w:left="2520" w:hanging="360"/>
+      </w:pPr>
+      <w:rPr>
+        <w:rFonts w:ascii="Symbol" w:hAnsi="Symbol" w:hint="default"/>
+      </w:rPr>
+    </w:lvl>
+    <w:lvl w:ilvl="4" w:tplc="04090003" w:tentative="1">
+      <w:start w:val="1"/>
+      <w:numFmt w:val="bullet"/>
+      <w:lvlText w:val="o"/>
+      <w:lvlJc w:val="left"/>
+      <w:pPr>
+        <w:ind w:left="3240" w:hanging="360"/>
+      </w:pPr>
+      <w:rPr>
+        <w:rFonts w:ascii="Courier New" w:hAnsi="Courier New" w:cs="Courier New" w:hint="default"/>
+      </w:rPr>
+    </w:lvl>
+    <w:lvl w:ilvl="5" w:tplc="04090005" w:tentative="1">
+      <w:start w:val="1"/>
+      <w:numFmt w:val="bullet"/>
+      <w:lvlText w:val=""/>
+      <w:lvlJc w:val="left"/>
+      <w:pPr>
+        <w:ind w:left="3960" w:hanging="360"/>
+      </w:pPr>
+      <w:rPr>
+        <w:rFonts w:ascii="Wingdings" w:hAnsi="Wingdings" w:hint="default"/>
+      </w:rPr>
+    </w:lvl>
+    <w:lvl w:ilvl="6" w:tplc="04090001" w:tentative="1">
+      <w:start w:val="1"/>
+      <w:numFmt w:val="bullet"/>
+      <w:lvlText w:val=""/>
+      <w:lvlJc w:val="left"/>
+      <w:pPr>
+        <w:ind w:left="4680" w:hanging="360"/>
+      </w:pPr>
+      <w:rPr>
+        <w:rFonts w:ascii="Symbol" w:hAnsi="Symbol" w:hint="default"/>
+      </w:rPr>
+    </w:lvl>
+    <w:lvl w:ilvl="7" w:tplc="04090003" w:tentative="1">
+      <w:start w:val="1"/>
+      <w:numFmt w:val="bullet"/>
+      <w:lvlText w:val="o"/>
+      <w:lvlJc w:val="left"/>
+      <w:pPr>
+        <w:ind w:left="5400" w:hanging="360"/>
+      </w:pPr>
+      <w:rPr>
+        <w:rFonts w:ascii="Courier New" w:hAnsi="Courier New" w:cs="Courier New" w:hint="default"/>
+      </w:rPr>
+    </w:lvl>
+    <w:lvl w:ilvl="8" w:tplc="04090005" w:tentative="1">
+      <w:start w:val="1"/>
+      <w:numFmt w:val="bullet"/>
+      <w:lvlText w:val=""/>
+      <w:lvlJc w:val="left"/>
+      <w:pPr>
+        <w:ind w:left="6120" w:hanging="360"/>
+      </w:pPr>
+      <w:rPr>
+        <w:rFonts w:ascii="Wingdings" w:hAnsi="Wingdings" w:hint="default"/>
+      </w:rPr>
+    </w:lvl>
+  </w:abstractNum>
+  <w:abstractNum w:abstractNumId="12" w15:restartNumberingAfterBreak="0">
     <w:nsid w:val="4D7241B9"/>
     <w:multiLevelType w:val="hybridMultilevel"/>
     <w:tmpl w:val="7312D364"/>
@@ -2503,7 +2892,7 @@
       <w:lvlJc w:val="left"/>
     </w:lvl>
   </w:abstractNum>
-  <w:abstractNum w:abstractNumId="10" w15:restartNumberingAfterBreak="0">
+  <w:abstractNum w:abstractNumId="13" w15:restartNumberingAfterBreak="0">
     <w:nsid w:val="4EC23A12"/>
     <w:multiLevelType w:val="hybridMultilevel"/>
     <w:tmpl w:val="21402106"/>
@@ -2616,7 +3005,7 @@
       </w:rPr>
     </w:lvl>
   </w:abstractNum>
-  <w:abstractNum w:abstractNumId="11" w15:restartNumberingAfterBreak="0">
+  <w:abstractNum w:abstractNumId="14" w15:restartNumberingAfterBreak="0">
     <w:nsid w:val="51087879"/>
     <w:multiLevelType w:val="hybridMultilevel"/>
     <w:tmpl w:val="061E04E4"/>
@@ -2728,7 +3117,7 @@
       </w:rPr>
     </w:lvl>
   </w:abstractNum>
-  <w:abstractNum w:abstractNumId="12" w15:restartNumberingAfterBreak="0">
+  <w:abstractNum w:abstractNumId="15" w15:restartNumberingAfterBreak="0">
     <w:nsid w:val="519744D9"/>
     <w:multiLevelType w:val="hybridMultilevel"/>
     <w:tmpl w:val="EA263C60"/>
@@ -2782,7 +3171,7 @@
       <w:lvlJc w:val="left"/>
     </w:lvl>
   </w:abstractNum>
-  <w:abstractNum w:abstractNumId="13" w15:restartNumberingAfterBreak="0">
+  <w:abstractNum w:abstractNumId="16" w15:restartNumberingAfterBreak="0">
     <w:nsid w:val="520146C0"/>
     <w:multiLevelType w:val="hybridMultilevel"/>
     <w:tmpl w:val="B6CAF6E2"/>
@@ -2895,7 +3284,120 @@
       </w:rPr>
     </w:lvl>
   </w:abstractNum>
-  <w:abstractNum w:abstractNumId="14" w15:restartNumberingAfterBreak="0">
+  <w:abstractNum w:abstractNumId="17" w15:restartNumberingAfterBreak="0">
+    <w:nsid w:val="54B605B8"/>
+    <w:multiLevelType w:val="hybridMultilevel"/>
+    <w:tmpl w:val="04AED938"/>
+    <w:lvl w:ilvl="0" w:tplc="04090001">
+      <w:start w:val="1"/>
+      <w:numFmt w:val="bullet"/>
+      <w:lvlText w:val=""/>
+      <w:lvlJc w:val="left"/>
+      <w:pPr>
+        <w:ind w:left="720" w:hanging="360"/>
+      </w:pPr>
+      <w:rPr>
+        <w:rFonts w:ascii="Symbol" w:hAnsi="Symbol" w:hint="default"/>
+      </w:rPr>
+    </w:lvl>
+    <w:lvl w:ilvl="1" w:tplc="04090003" w:tentative="1">
+      <w:start w:val="1"/>
+      <w:numFmt w:val="bullet"/>
+      <w:lvlText w:val="o"/>
+      <w:lvlJc w:val="left"/>
+      <w:pPr>
+        <w:ind w:left="1440" w:hanging="360"/>
+      </w:pPr>
+      <w:rPr>
+        <w:rFonts w:ascii="Courier New" w:hAnsi="Courier New" w:cs="Courier New" w:hint="default"/>
+      </w:rPr>
+    </w:lvl>
+    <w:lvl w:ilvl="2" w:tplc="04090005" w:tentative="1">
+      <w:start w:val="1"/>
+      <w:numFmt w:val="bullet"/>
+      <w:lvlText w:val=""/>
+      <w:lvlJc w:val="left"/>
+      <w:pPr>
+        <w:ind w:left="2160" w:hanging="360"/>
+      </w:pPr>
+      <w:rPr>
+        <w:rFonts w:ascii="Wingdings" w:hAnsi="Wingdings" w:hint="default"/>
+      </w:rPr>
+    </w:lvl>
+    <w:lvl w:ilvl="3" w:tplc="04090001" w:tentative="1">
+      <w:start w:val="1"/>
+      <w:numFmt w:val="bullet"/>
+      <w:lvlText w:val=""/>
+      <w:lvlJc w:val="left"/>
+      <w:pPr>
+        <w:ind w:left="2880" w:hanging="360"/>
+      </w:pPr>
+      <w:rPr>
+        <w:rFonts w:ascii="Symbol" w:hAnsi="Symbol" w:hint="default"/>
+      </w:rPr>
+    </w:lvl>
+    <w:lvl w:ilvl="4" w:tplc="04090003" w:tentative="1">
+      <w:start w:val="1"/>
+      <w:numFmt w:val="bullet"/>
+      <w:lvlText w:val="o"/>
+      <w:lvlJc w:val="left"/>
+      <w:pPr>
+        <w:ind w:left="3600" w:hanging="360"/>
+      </w:pPr>
+      <w:rPr>
+        <w:rFonts w:ascii="Courier New" w:hAnsi="Courier New" w:cs="Courier New" w:hint="default"/>
+      </w:rPr>
+    </w:lvl>
+    <w:lvl w:ilvl="5" w:tplc="04090005" w:tentative="1">
+      <w:start w:val="1"/>
+      <w:numFmt w:val="bullet"/>
+      <w:lvlText w:val=""/>
+      <w:lvlJc w:val="left"/>
+      <w:pPr>
+        <w:ind w:left="4320" w:hanging="360"/>
+      </w:pPr>
+      <w:rPr>
+        <w:rFonts w:ascii="Wingdings" w:hAnsi="Wingdings" w:hint="default"/>
+      </w:rPr>
+    </w:lvl>
+    <w:lvl w:ilvl="6" w:tplc="04090001" w:tentative="1">
+      <w:start w:val="1"/>
+      <w:numFmt w:val="bullet"/>
+      <w:lvlText w:val=""/>
+      <w:lvlJc w:val="left"/>
+      <w:pPr>
+        <w:ind w:left="5040" w:hanging="360"/>
+      </w:pPr>
+      <w:rPr>
+        <w:rFonts w:ascii="Symbol" w:hAnsi="Symbol" w:hint="default"/>
+      </w:rPr>
+    </w:lvl>
+    <w:lvl w:ilvl="7" w:tplc="04090003" w:tentative="1">
+      <w:start w:val="1"/>
+      <w:numFmt w:val="bullet"/>
+      <w:lvlText w:val="o"/>
+      <w:lvlJc w:val="left"/>
+      <w:pPr>
+        <w:ind w:left="5760" w:hanging="360"/>
+      </w:pPr>
+      <w:rPr>
+        <w:rFonts w:ascii="Courier New" w:hAnsi="Courier New" w:cs="Courier New" w:hint="default"/>
+      </w:rPr>
+    </w:lvl>
+    <w:lvl w:ilvl="8" w:tplc="04090005" w:tentative="1">
+      <w:start w:val="1"/>
+      <w:numFmt w:val="bullet"/>
+      <w:lvlText w:val=""/>
+      <w:lvlJc w:val="left"/>
+      <w:pPr>
+        <w:ind w:left="6480" w:hanging="360"/>
+      </w:pPr>
+      <w:rPr>
+        <w:rFonts w:ascii="Wingdings" w:hAnsi="Wingdings" w:hint="default"/>
+      </w:rPr>
+    </w:lvl>
+  </w:abstractNum>
+  <w:abstractNum w:abstractNumId="18" w15:restartNumberingAfterBreak="0">
     <w:nsid w:val="5BB27E4F"/>
     <w:multiLevelType w:val="hybridMultilevel"/>
     <w:tmpl w:val="E6AE49DE"/>
@@ -3005,7 +3507,7 @@
       </w:rPr>
     </w:lvl>
   </w:abstractNum>
-  <w:abstractNum w:abstractNumId="15" w15:restartNumberingAfterBreak="0">
+  <w:abstractNum w:abstractNumId="19" w15:restartNumberingAfterBreak="0">
     <w:nsid w:val="5EF533E4"/>
     <w:multiLevelType w:val="hybridMultilevel"/>
     <w:tmpl w:val="E81C3114"/>
@@ -3059,7 +3561,120 @@
       <w:lvlJc w:val="left"/>
     </w:lvl>
   </w:abstractNum>
-  <w:abstractNum w:abstractNumId="16" w15:restartNumberingAfterBreak="0">
+  <w:abstractNum w:abstractNumId="20" w15:restartNumberingAfterBreak="0">
+    <w:nsid w:val="5F36733C"/>
+    <w:multiLevelType w:val="hybridMultilevel"/>
+    <w:tmpl w:val="1ACA1F76"/>
+    <w:lvl w:ilvl="0" w:tplc="04090001">
+      <w:start w:val="1"/>
+      <w:numFmt w:val="bullet"/>
+      <w:lvlText w:val=""/>
+      <w:lvlJc w:val="left"/>
+      <w:pPr>
+        <w:ind w:left="720" w:hanging="360"/>
+      </w:pPr>
+      <w:rPr>
+        <w:rFonts w:ascii="Symbol" w:hAnsi="Symbol" w:hint="default"/>
+      </w:rPr>
+    </w:lvl>
+    <w:lvl w:ilvl="1" w:tplc="04090003" w:tentative="1">
+      <w:start w:val="1"/>
+      <w:numFmt w:val="bullet"/>
+      <w:lvlText w:val="o"/>
+      <w:lvlJc w:val="left"/>
+      <w:pPr>
+        <w:ind w:left="1440" w:hanging="360"/>
+      </w:pPr>
+      <w:rPr>
+        <w:rFonts w:ascii="Courier New" w:hAnsi="Courier New" w:cs="Courier New" w:hint="default"/>
+      </w:rPr>
+    </w:lvl>
+    <w:lvl w:ilvl="2" w:tplc="04090005" w:tentative="1">
+      <w:start w:val="1"/>
+      <w:numFmt w:val="bullet"/>
+      <w:lvlText w:val=""/>
+      <w:lvlJc w:val="left"/>
+      <w:pPr>
+        <w:ind w:left="2160" w:hanging="360"/>
+      </w:pPr>
+      <w:rPr>
+        <w:rFonts w:ascii="Wingdings" w:hAnsi="Wingdings" w:hint="default"/>
+      </w:rPr>
+    </w:lvl>
+    <w:lvl w:ilvl="3" w:tplc="04090001" w:tentative="1">
+      <w:start w:val="1"/>
+      <w:numFmt w:val="bullet"/>
+      <w:lvlText w:val=""/>
+      <w:lvlJc w:val="left"/>
+      <w:pPr>
+        <w:ind w:left="2880" w:hanging="360"/>
+      </w:pPr>
+      <w:rPr>
+        <w:rFonts w:ascii="Symbol" w:hAnsi="Symbol" w:hint="default"/>
+      </w:rPr>
+    </w:lvl>
+    <w:lvl w:ilvl="4" w:tplc="04090003" w:tentative="1">
+      <w:start w:val="1"/>
+      <w:numFmt w:val="bullet"/>
+      <w:lvlText w:val="o"/>
+      <w:lvlJc w:val="left"/>
+      <w:pPr>
+        <w:ind w:left="3600" w:hanging="360"/>
+      </w:pPr>
+      <w:rPr>
+        <w:rFonts w:ascii="Courier New" w:hAnsi="Courier New" w:cs="Courier New" w:hint="default"/>
+      </w:rPr>
+    </w:lvl>
+    <w:lvl w:ilvl="5" w:tplc="04090005" w:tentative="1">
+      <w:start w:val="1"/>
+      <w:numFmt w:val="bullet"/>
+      <w:lvlText w:val=""/>
+      <w:lvlJc w:val="left"/>
+      <w:pPr>
+        <w:ind w:left="4320" w:hanging="360"/>
+      </w:pPr>
+      <w:rPr>
+        <w:rFonts w:ascii="Wingdings" w:hAnsi="Wingdings" w:hint="default"/>
+      </w:rPr>
+    </w:lvl>
+    <w:lvl w:ilvl="6" w:tplc="04090001" w:tentative="1">
+      <w:start w:val="1"/>
+      <w:numFmt w:val="bullet"/>
+      <w:lvlText w:val=""/>
+      <w:lvlJc w:val="left"/>
+      <w:pPr>
+        <w:ind w:left="5040" w:hanging="360"/>
+      </w:pPr>
+      <w:rPr>
+        <w:rFonts w:ascii="Symbol" w:hAnsi="Symbol" w:hint="default"/>
+      </w:rPr>
+    </w:lvl>
+    <w:lvl w:ilvl="7" w:tplc="04090003" w:tentative="1">
+      <w:start w:val="1"/>
+      <w:numFmt w:val="bullet"/>
+      <w:lvlText w:val="o"/>
+      <w:lvlJc w:val="left"/>
+      <w:pPr>
+        <w:ind w:left="5760" w:hanging="360"/>
+      </w:pPr>
+      <w:rPr>
+        <w:rFonts w:ascii="Courier New" w:hAnsi="Courier New" w:cs="Courier New" w:hint="default"/>
+      </w:rPr>
+    </w:lvl>
+    <w:lvl w:ilvl="8" w:tplc="04090005" w:tentative="1">
+      <w:start w:val="1"/>
+      <w:numFmt w:val="bullet"/>
+      <w:lvlText w:val=""/>
+      <w:lvlJc w:val="left"/>
+      <w:pPr>
+        <w:ind w:left="6480" w:hanging="360"/>
+      </w:pPr>
+      <w:rPr>
+        <w:rFonts w:ascii="Wingdings" w:hAnsi="Wingdings" w:hint="default"/>
+      </w:rPr>
+    </w:lvl>
+  </w:abstractNum>
+  <w:abstractNum w:abstractNumId="21" w15:restartNumberingAfterBreak="0">
     <w:nsid w:val="632E2343"/>
     <w:multiLevelType w:val="hybridMultilevel"/>
     <w:tmpl w:val="387072E8"/>
@@ -3172,7 +3787,7 @@
       </w:rPr>
     </w:lvl>
   </w:abstractNum>
-  <w:abstractNum w:abstractNumId="17" w15:restartNumberingAfterBreak="0">
+  <w:abstractNum w:abstractNumId="22" w15:restartNumberingAfterBreak="0">
     <w:nsid w:val="6BF1453D"/>
     <w:multiLevelType w:val="hybridMultilevel"/>
     <w:tmpl w:val="4BDE07A2"/>
@@ -3284,7 +3899,120 @@
       </w:rPr>
     </w:lvl>
   </w:abstractNum>
-  <w:abstractNum w:abstractNumId="18" w15:restartNumberingAfterBreak="0">
+  <w:abstractNum w:abstractNumId="23" w15:restartNumberingAfterBreak="0">
+    <w:nsid w:val="743B5008"/>
+    <w:multiLevelType w:val="hybridMultilevel"/>
+    <w:tmpl w:val="F1F632EA"/>
+    <w:lvl w:ilvl="0" w:tplc="04090001">
+      <w:start w:val="1"/>
+      <w:numFmt w:val="bullet"/>
+      <w:lvlText w:val=""/>
+      <w:lvlJc w:val="left"/>
+      <w:pPr>
+        <w:ind w:left="720" w:hanging="360"/>
+      </w:pPr>
+      <w:rPr>
+        <w:rFonts w:ascii="Symbol" w:hAnsi="Symbol" w:hint="default"/>
+      </w:rPr>
+    </w:lvl>
+    <w:lvl w:ilvl="1" w:tplc="04090003" w:tentative="1">
+      <w:start w:val="1"/>
+      <w:numFmt w:val="bullet"/>
+      <w:lvlText w:val="o"/>
+      <w:lvlJc w:val="left"/>
+      <w:pPr>
+        <w:ind w:left="1440" w:hanging="360"/>
+      </w:pPr>
+      <w:rPr>
+        <w:rFonts w:ascii="Courier New" w:hAnsi="Courier New" w:cs="Courier New" w:hint="default"/>
+      </w:rPr>
+    </w:lvl>
+    <w:lvl w:ilvl="2" w:tplc="04090005" w:tentative="1">
+      <w:start w:val="1"/>
+      <w:numFmt w:val="bullet"/>
+      <w:lvlText w:val=""/>
+      <w:lvlJc w:val="left"/>
+      <w:pPr>
+        <w:ind w:left="2160" w:hanging="360"/>
+      </w:pPr>
+      <w:rPr>
+        <w:rFonts w:ascii="Wingdings" w:hAnsi="Wingdings" w:hint="default"/>
+      </w:rPr>
+    </w:lvl>
+    <w:lvl w:ilvl="3" w:tplc="04090001" w:tentative="1">
+      <w:start w:val="1"/>
+      <w:numFmt w:val="bullet"/>
+      <w:lvlText w:val=""/>
+      <w:lvlJc w:val="left"/>
+      <w:pPr>
+        <w:ind w:left="2880" w:hanging="360"/>
+      </w:pPr>
+      <w:rPr>
+        <w:rFonts w:ascii="Symbol" w:hAnsi="Symbol" w:hint="default"/>
+      </w:rPr>
+    </w:lvl>
+    <w:lvl w:ilvl="4" w:tplc="04090003" w:tentative="1">
+      <w:start w:val="1"/>
+      <w:numFmt w:val="bullet"/>
+      <w:lvlText w:val="o"/>
+      <w:lvlJc w:val="left"/>
+      <w:pPr>
+        <w:ind w:left="3600" w:hanging="360"/>
+      </w:pPr>
+      <w:rPr>
+        <w:rFonts w:ascii="Courier New" w:hAnsi="Courier New" w:cs="Courier New" w:hint="default"/>
+      </w:rPr>
+    </w:lvl>
+    <w:lvl w:ilvl="5" w:tplc="04090005" w:tentative="1">
+      <w:start w:val="1"/>
+      <w:numFmt w:val="bullet"/>
+      <w:lvlText w:val=""/>
+      <w:lvlJc w:val="left"/>
+      <w:pPr>
+        <w:ind w:left="4320" w:hanging="360"/>
+      </w:pPr>
+      <w:rPr>
+        <w:rFonts w:ascii="Wingdings" w:hAnsi="Wingdings" w:hint="default"/>
+      </w:rPr>
+    </w:lvl>
+    <w:lvl w:ilvl="6" w:tplc="04090001" w:tentative="1">
+      <w:start w:val="1"/>
+      <w:numFmt w:val="bullet"/>
+      <w:lvlText w:val=""/>
+      <w:lvlJc w:val="left"/>
+      <w:pPr>
+        <w:ind w:left="5040" w:hanging="360"/>
+      </w:pPr>
+      <w:rPr>
+        <w:rFonts w:ascii="Symbol" w:hAnsi="Symbol" w:hint="default"/>
+      </w:rPr>
+    </w:lvl>
+    <w:lvl w:ilvl="7" w:tplc="04090003" w:tentative="1">
+      <w:start w:val="1"/>
+      <w:numFmt w:val="bullet"/>
+      <w:lvlText w:val="o"/>
+      <w:lvlJc w:val="left"/>
+      <w:pPr>
+        <w:ind w:left="5760" w:hanging="360"/>
+      </w:pPr>
+      <w:rPr>
+        <w:rFonts w:ascii="Courier New" w:hAnsi="Courier New" w:cs="Courier New" w:hint="default"/>
+      </w:rPr>
+    </w:lvl>
+    <w:lvl w:ilvl="8" w:tplc="04090005" w:tentative="1">
+      <w:start w:val="1"/>
+      <w:numFmt w:val="bullet"/>
+      <w:lvlText w:val=""/>
+      <w:lvlJc w:val="left"/>
+      <w:pPr>
+        <w:ind w:left="6480" w:hanging="360"/>
+      </w:pPr>
+      <w:rPr>
+        <w:rFonts w:ascii="Wingdings" w:hAnsi="Wingdings" w:hint="default"/>
+      </w:rPr>
+    </w:lvl>
+  </w:abstractNum>
+  <w:abstractNum w:abstractNumId="24" w15:restartNumberingAfterBreak="0">
     <w:nsid w:val="75CD06EC"/>
     <w:multiLevelType w:val="hybridMultilevel"/>
     <w:tmpl w:val="9FD2C5DA"/>
@@ -3397,7 +4125,7 @@
       </w:rPr>
     </w:lvl>
   </w:abstractNum>
-  <w:abstractNum w:abstractNumId="19" w15:restartNumberingAfterBreak="0">
+  <w:abstractNum w:abstractNumId="25" w15:restartNumberingAfterBreak="0">
     <w:nsid w:val="764D3BF3"/>
     <w:multiLevelType w:val="hybridMultilevel"/>
     <w:tmpl w:val="596CF18A"/>
@@ -3509,77 +4237,211 @@
       </w:rPr>
     </w:lvl>
   </w:abstractNum>
+  <w:abstractNum w:abstractNumId="26" w15:restartNumberingAfterBreak="0">
+    <w:nsid w:val="7DEE6453"/>
+    <w:multiLevelType w:val="hybridMultilevel"/>
+    <w:tmpl w:val="45485F52"/>
+    <w:lvl w:ilvl="0" w:tplc="04090001">
+      <w:start w:val="1"/>
+      <w:numFmt w:val="bullet"/>
+      <w:lvlText w:val=""/>
+      <w:lvlJc w:val="left"/>
+      <w:pPr>
+        <w:ind w:left="720" w:hanging="360"/>
+      </w:pPr>
+      <w:rPr>
+        <w:rFonts w:ascii="Symbol" w:hAnsi="Symbol" w:hint="default"/>
+      </w:rPr>
+    </w:lvl>
+    <w:lvl w:ilvl="1" w:tplc="04090003" w:tentative="1">
+      <w:start w:val="1"/>
+      <w:numFmt w:val="bullet"/>
+      <w:lvlText w:val="o"/>
+      <w:lvlJc w:val="left"/>
+      <w:pPr>
+        <w:ind w:left="1440" w:hanging="360"/>
+      </w:pPr>
+      <w:rPr>
+        <w:rFonts w:ascii="Courier New" w:hAnsi="Courier New" w:cs="Courier New" w:hint="default"/>
+      </w:rPr>
+    </w:lvl>
+    <w:lvl w:ilvl="2" w:tplc="04090005" w:tentative="1">
+      <w:start w:val="1"/>
+      <w:numFmt w:val="bullet"/>
+      <w:lvlText w:val=""/>
+      <w:lvlJc w:val="left"/>
+      <w:pPr>
+        <w:ind w:left="2160" w:hanging="360"/>
+      </w:pPr>
+      <w:rPr>
+        <w:rFonts w:ascii="Wingdings" w:hAnsi="Wingdings" w:hint="default"/>
+      </w:rPr>
+    </w:lvl>
+    <w:lvl w:ilvl="3" w:tplc="04090001" w:tentative="1">
+      <w:start w:val="1"/>
+      <w:numFmt w:val="bullet"/>
+      <w:lvlText w:val=""/>
+      <w:lvlJc w:val="left"/>
+      <w:pPr>
+        <w:ind w:left="2880" w:hanging="360"/>
+      </w:pPr>
+      <w:rPr>
+        <w:rFonts w:ascii="Symbol" w:hAnsi="Symbol" w:hint="default"/>
+      </w:rPr>
+    </w:lvl>
+    <w:lvl w:ilvl="4" w:tplc="04090003" w:tentative="1">
+      <w:start w:val="1"/>
+      <w:numFmt w:val="bullet"/>
+      <w:lvlText w:val="o"/>
+      <w:lvlJc w:val="left"/>
+      <w:pPr>
+        <w:ind w:left="3600" w:hanging="360"/>
+      </w:pPr>
+      <w:rPr>
+        <w:rFonts w:ascii="Courier New" w:hAnsi="Courier New" w:cs="Courier New" w:hint="default"/>
+      </w:rPr>
+    </w:lvl>
+    <w:lvl w:ilvl="5" w:tplc="04090005" w:tentative="1">
+      <w:start w:val="1"/>
+      <w:numFmt w:val="bullet"/>
+      <w:lvlText w:val=""/>
+      <w:lvlJc w:val="left"/>
+      <w:pPr>
+        <w:ind w:left="4320" w:hanging="360"/>
+      </w:pPr>
+      <w:rPr>
+        <w:rFonts w:ascii="Wingdings" w:hAnsi="Wingdings" w:hint="default"/>
+      </w:rPr>
+    </w:lvl>
+    <w:lvl w:ilvl="6" w:tplc="04090001" w:tentative="1">
+      <w:start w:val="1"/>
+      <w:numFmt w:val="bullet"/>
+      <w:lvlText w:val=""/>
+      <w:lvlJc w:val="left"/>
+      <w:pPr>
+        <w:ind w:left="5040" w:hanging="360"/>
+      </w:pPr>
+      <w:rPr>
+        <w:rFonts w:ascii="Symbol" w:hAnsi="Symbol" w:hint="default"/>
+      </w:rPr>
+    </w:lvl>
+    <w:lvl w:ilvl="7" w:tplc="04090003" w:tentative="1">
+      <w:start w:val="1"/>
+      <w:numFmt w:val="bullet"/>
+      <w:lvlText w:val="o"/>
+      <w:lvlJc w:val="left"/>
+      <w:pPr>
+        <w:ind w:left="5760" w:hanging="360"/>
+      </w:pPr>
+      <w:rPr>
+        <w:rFonts w:ascii="Courier New" w:hAnsi="Courier New" w:cs="Courier New" w:hint="default"/>
+      </w:rPr>
+    </w:lvl>
+    <w:lvl w:ilvl="8" w:tplc="04090005" w:tentative="1">
+      <w:start w:val="1"/>
+      <w:numFmt w:val="bullet"/>
+      <w:lvlText w:val=""/>
+      <w:lvlJc w:val="left"/>
+      <w:pPr>
+        <w:ind w:left="6480" w:hanging="360"/>
+      </w:pPr>
+      <w:rPr>
+        <w:rFonts w:ascii="Wingdings" w:hAnsi="Wingdings" w:hint="default"/>
+      </w:rPr>
+    </w:lvl>
+  </w:abstractNum>
   <w:num w:numId="1" w16cid:durableId="931280016">
-    <w:abstractNumId w:val="4"/>
+    <w:abstractNumId w:val="6"/>
     <w:lvlOverride w:ilvl="0">
       <w:startOverride w:val="1"/>
     </w:lvlOverride>
   </w:num>
   <w:num w:numId="2" w16cid:durableId="1651904767">
+    <w:abstractNumId w:val="19"/>
+    <w:lvlOverride w:ilvl="0">
+      <w:startOverride w:val="1"/>
+    </w:lvlOverride>
+  </w:num>
+  <w:num w:numId="3" w16cid:durableId="115416583">
+    <w:abstractNumId w:val="8"/>
+  </w:num>
+  <w:num w:numId="4" w16cid:durableId="882132697">
+    <w:abstractNumId w:val="9"/>
+  </w:num>
+  <w:num w:numId="5" w16cid:durableId="80101390">
+    <w:abstractNumId w:val="21"/>
+  </w:num>
+  <w:num w:numId="6" w16cid:durableId="1862818740">
+    <w:abstractNumId w:val="19"/>
+  </w:num>
+  <w:num w:numId="7" w16cid:durableId="594630185">
+    <w:abstractNumId w:val="12"/>
+  </w:num>
+  <w:num w:numId="8" w16cid:durableId="1868443297">
+    <w:abstractNumId w:val="0"/>
+  </w:num>
+  <w:num w:numId="9" w16cid:durableId="1056592066">
+    <w:abstractNumId w:val="24"/>
+  </w:num>
+  <w:num w:numId="10" w16cid:durableId="828640024">
+    <w:abstractNumId w:val="25"/>
+  </w:num>
+  <w:num w:numId="11" w16cid:durableId="308050003">
+    <w:abstractNumId w:val="16"/>
+  </w:num>
+  <w:num w:numId="12" w16cid:durableId="1341391005">
+    <w:abstractNumId w:val="10"/>
+  </w:num>
+  <w:num w:numId="13" w16cid:durableId="890268951">
+    <w:abstractNumId w:val="18"/>
+  </w:num>
+  <w:num w:numId="14" w16cid:durableId="1630285433">
+    <w:abstractNumId w:val="2"/>
+  </w:num>
+  <w:num w:numId="15" w16cid:durableId="733895380">
+    <w:abstractNumId w:val="22"/>
+  </w:num>
+  <w:num w:numId="16" w16cid:durableId="9531761">
+    <w:abstractNumId w:val="13"/>
+  </w:num>
+  <w:num w:numId="17" w16cid:durableId="1001129840">
     <w:abstractNumId w:val="15"/>
     <w:lvlOverride w:ilvl="0">
       <w:startOverride w:val="1"/>
     </w:lvlOverride>
   </w:num>
-  <w:num w:numId="3" w16cid:durableId="115416583">
-    <w:abstractNumId w:val="6"/>
+  <w:num w:numId="18" w16cid:durableId="1784378016">
+    <w:abstractNumId w:val="5"/>
   </w:num>
-  <w:num w:numId="4" w16cid:durableId="882132697">
+  <w:num w:numId="19" w16cid:durableId="461386990">
+    <w:abstractNumId w:val="14"/>
+  </w:num>
+  <w:num w:numId="20" w16cid:durableId="1049454639">
     <w:abstractNumId w:val="7"/>
   </w:num>
-  <w:num w:numId="5" w16cid:durableId="80101390">
-    <w:abstractNumId w:val="16"/>
+  <w:num w:numId="21" w16cid:durableId="1004474726">
+    <w:abstractNumId w:val="3"/>
   </w:num>
-  <w:num w:numId="6" w16cid:durableId="1862818740">
-    <w:abstractNumId w:val="15"/>
+  <w:num w:numId="22" w16cid:durableId="624165284">
+    <w:abstractNumId w:val="4"/>
   </w:num>
-  <w:num w:numId="7" w16cid:durableId="594630185">
-    <w:abstractNumId w:val="9"/>
+  <w:num w:numId="23" w16cid:durableId="1617056415">
+    <w:abstractNumId w:val="17"/>
   </w:num>
-  <w:num w:numId="8" w16cid:durableId="1868443297">
-    <w:abstractNumId w:val="0"/>
+  <w:num w:numId="24" w16cid:durableId="660083625">
+    <w:abstractNumId w:val="23"/>
   </w:num>
-  <w:num w:numId="9" w16cid:durableId="1056592066">
-    <w:abstractNumId w:val="18"/>
+  <w:num w:numId="25" w16cid:durableId="367685355">
+    <w:abstractNumId w:val="26"/>
   </w:num>
-  <w:num w:numId="10" w16cid:durableId="828640024">
-    <w:abstractNumId w:val="19"/>
+  <w:num w:numId="26" w16cid:durableId="894858506">
+    <w:abstractNumId w:val="20"/>
   </w:num>
-  <w:num w:numId="11" w16cid:durableId="308050003">
-    <w:abstractNumId w:val="13"/>
-  </w:num>
-  <w:num w:numId="12" w16cid:durableId="1341391005">
-    <w:abstractNumId w:val="8"/>
-  </w:num>
-  <w:num w:numId="13" w16cid:durableId="890268951">
-    <w:abstractNumId w:val="14"/>
-  </w:num>
-  <w:num w:numId="14" w16cid:durableId="1630285433">
+  <w:num w:numId="27" w16cid:durableId="785464811">
     <w:abstractNumId w:val="1"/>
   </w:num>
-  <w:num w:numId="15" w16cid:durableId="733895380">
-    <w:abstractNumId w:val="17"/>
-  </w:num>
-  <w:num w:numId="16" w16cid:durableId="9531761">
-    <w:abstractNumId w:val="10"/>
-  </w:num>
-  <w:num w:numId="17" w16cid:durableId="1001129840">
-    <w:abstractNumId w:val="12"/>
-    <w:lvlOverride w:ilvl="0">
-      <w:startOverride w:val="1"/>
-    </w:lvlOverride>
-  </w:num>
-  <w:num w:numId="18" w16cid:durableId="1784378016">
-    <w:abstractNumId w:val="3"/>
-  </w:num>
-  <w:num w:numId="19" w16cid:durableId="461386990">
+  <w:num w:numId="28" w16cid:durableId="664170885">
     <w:abstractNumId w:val="11"/>
-  </w:num>
-  <w:num w:numId="20" w16cid:durableId="1049454639">
-    <w:abstractNumId w:val="5"/>
-  </w:num>
-  <w:num w:numId="21" w16cid:durableId="1004474726">
-    <w:abstractNumId w:val="2"/>
   </w:num>
 </w:numbering>
 </file>

</xml_diff>

<commit_message>
Debug points for interview update and resume updated
</commit_message>
<xml_diff>
--- a/Aravinth K First Draft.docx
+++ b/Aravinth K First Draft.docx
@@ -126,7 +126,13 @@
         <w:spacing w:before="280" w:after="100"/>
       </w:pPr>
       <w:r>
-        <w:t xml:space="preserve">Senior Embedded Firmware Engineer with 6+ years of experience in embedded firmware development, debugging, integration and validation across industrial automation and consumer electronics </w:t>
+        <w:t xml:space="preserve">Senior Embedded Firmware Engineer with </w:t>
+      </w:r>
+      <w:r>
+        <w:t>5</w:t>
+      </w:r>
+      <w:r>
+        <w:t xml:space="preserve">+ years of experience in embedded firmware development, debugging, integration and validation across industrial automation and consumer electronics </w:t>
       </w:r>
       <w:r>
         <w:t>domains. Skilled</w:t>
@@ -355,10 +361,7 @@
         <w:t xml:space="preserve">Embedded Software Design, System Integration, </w:t>
       </w:r>
       <w:r>
-        <w:t>Debugging</w:t>
-      </w:r>
-      <w:r>
-        <w:t xml:space="preserve">, </w:t>
+        <w:t xml:space="preserve">Debugging, </w:t>
       </w:r>
       <w:r>
         <w:t>Root Cause Analysis</w:t>
@@ -416,16 +419,10 @@
         <w:t xml:space="preserve">, JIRA, GDB, JTAG, </w:t>
       </w:r>
       <w:r>
-        <w:t>Oscilloscope</w:t>
-      </w:r>
-      <w:r>
-        <w:t>,</w:t>
-      </w:r>
-      <w:r>
-        <w:t xml:space="preserve"> </w:t>
-      </w:r>
-      <w:r>
-        <w:t>Logic Analyzer</w:t>
+        <w:t>Oscilloscope,</w:t>
+      </w:r>
+      <w:r>
+        <w:t xml:space="preserve"> Logic Analyzer</w:t>
       </w:r>
       <w:r>
         <w:t xml:space="preserve">, VS Code, Keil MDK, MPLAB X, Atmel Studio, </w:t>
@@ -604,7 +601,25 @@
         <w:spacing w:before="58" w:after="58"/>
       </w:pPr>
       <w:r>
-        <w:t>Developed firmware for three commercial Corsair sim-racing products using Zephyr RTOS, including Handbrake, PVGT Porsche and Formula V3 Steering Wheel.</w:t>
+        <w:t xml:space="preserve">Developed firmware for </w:t>
+      </w:r>
+      <w:r>
+        <w:t>3</w:t>
+      </w:r>
+      <w:r>
+        <w:t xml:space="preserve"> commercial Corsair sim-racing products using Zephyr RTOS, including Handbrake, PVGT Porsche and </w:t>
+      </w:r>
+      <w:r>
+        <w:t>Form</w:t>
+      </w:r>
+      <w:r>
+        <w:t>u</w:t>
+      </w:r>
+      <w:r>
+        <w:t>la</w:t>
+      </w:r>
+      <w:r>
+        <w:t xml:space="preserve"> V3 Steering Wheel.</w:t>
       </w:r>
     </w:p>
     <w:p>
@@ -872,7 +887,13 @@
         <w:spacing w:before="160" w:after="38"/>
       </w:pPr>
       <w:r>
-        <w:t xml:space="preserve">Sole firmware engineer for a Three-Layer Conveyor System </w:t>
+        <w:t xml:space="preserve">Sole firmware engineer for a </w:t>
+      </w:r>
+      <w:r>
+        <w:t>3</w:t>
+      </w:r>
+      <w:r>
+        <w:t xml:space="preserve">-Layer Conveyor System </w:t>
       </w:r>
       <w:r>
         <w:t>(</w:t>
@@ -884,7 +905,7 @@
         <w:t>automation)</w:t>
       </w:r>
       <w:r>
-        <w:t xml:space="preserve"> delivered firmware development, system integration, testing, and on-site deployment end-to-end in under 4 months</w:t>
+        <w:t xml:space="preserve"> delivered firmware development, system integration, testing and on-site deployment end-to-end in under 4 months</w:t>
       </w:r>
       <w:r>
         <w:t>.</w:t>
@@ -1048,7 +1069,27 @@
           <w:sz w:val="18"/>
           <w:szCs w:val="18"/>
         </w:rPr>
-        <w:t>Embedded C, Zephyr RTOS, LPC, CAN, SPI, I2C</w:t>
+        <w:t xml:space="preserve">Embedded C, Zephyr RTOS, </w:t>
+      </w:r>
+      <w:r>
+        <w:rPr>
+          <w:i/>
+          <w:iCs/>
+          <w:color w:val="0D7490"/>
+          <w:sz w:val="18"/>
+          <w:szCs w:val="18"/>
+        </w:rPr>
+        <w:t xml:space="preserve">NXP </w:t>
+      </w:r>
+      <w:r>
+        <w:rPr>
+          <w:i/>
+          <w:iCs/>
+          <w:color w:val="0D7490"/>
+          <w:sz w:val="18"/>
+          <w:szCs w:val="18"/>
+        </w:rPr>
+        <w:t>LPC, CAN, SPI, I2C</w:t>
       </w:r>
     </w:p>
     <w:p>
@@ -1080,7 +1121,13 @@
         <w:spacing w:before="160" w:after="38"/>
       </w:pPr>
       <w:r>
-        <w:t>Developed and customized firmware for the PVGT Porsche and Formula V3 Steering Wheels using Zephyr RTOS by extending an existing firmware framework. Implemented product-specific features, performed product integration and system-level testing, and supported release activities.</w:t>
+        <w:t>Developed and customized firmware for the PVGT Porsche and Formula V3 Steering Wheels using Zephyr RTOS by extending an existing firmware framework. Implemented product-specific features, performed product integration</w:t>
+      </w:r>
+      <w:r>
+        <w:t xml:space="preserve">, </w:t>
+      </w:r>
+      <w:r>
+        <w:t>system-level testing and supported release activities.</w:t>
       </w:r>
     </w:p>
     <w:p>
@@ -4927,6 +4974,7 @@
   <w:style w:type="character" w:default="1" w:styleId="DefaultParagraphFont">
     <w:name w:val="Default Paragraph Font"/>
     <w:uiPriority w:val="1"/>
+    <w:semiHidden/>
     <w:unhideWhenUsed/>
   </w:style>
   <w:style w:type="table" w:default="1" w:styleId="TableNormal">

</xml_diff>